<commit_message>
Set illustrative grid delay and restructure decision memo
</commit_message>
<xml_diff>
--- a/deliverables/University_AI_Data_Center_Decision_Memo.docx
+++ b/deliverables/University_AI_Data_Center_Decision_Memo.docx
@@ -65,12 +65,12 @@
         <w:pStyle w:val="Heading1"/>
       </w:pPr>
       <w:r>
-        <w:t>Decision requested</w:t>
+        <w:t>Executive summary</w:t>
       </w:r>
     </w:p>
     <w:p>
       <w:r>
-        <w:t>Authorize the next stage of site, utility and member-demand diligence for a shared AI data center in Texas. Do not authorize full construction or equipment procurement yet. The current comparison favors Texas, but a binding capital decision depends on a written grid schedule and cost, a site-specific resilience design, committed member demand and priced vendor offers.</w:t>
+        <w:t>The committee is considering a shared AI data center for university members. We recommend Texas as the reference location and authorization of a bounded diligence stage, not construction or equipment procurement. Texas leads the weighted site comparison (3.60 versus 3.05 for Québec and Helsinki), chiefly because it reaches more of the modeled member demand within the 50 ms threshold. The 20 MW IT reference design implies 25 MW at the facility and 219 GWh of annual electricity demand. That scale makes grid timing, power terms, resilience and contracted member demand decisive. Return for a capital decision only with a written utility schedule and cost, site-specific engineering, member commitments and priced delivery options.</w:t>
       </w:r>
     </w:p>
     <w:p>
@@ -78,12 +78,12 @@
         <w:pStyle w:val="Heading1"/>
       </w:pPr>
       <w:r>
-        <w:t>Why Texas leads</w:t>
+        <w:t>1. Site selection: proximity gives Texas the lead</w:t>
       </w:r>
     </w:p>
     <w:p>
       <w:r>
-        <w:t>The project compared Texas, Québec and Helsinki using one weighted rubric. Texas scores 3.60; the other two reference locations each score 3.05. Demand proximity has the largest weight. In the modeled demand distribution, Texas places 62.3% of addressable demand inside a 50 ms round trip, compared with 50.7% for Québec and 19.5% for Helsinki. These scores are planning judgments, not utility bids or a final property selection.</w:t>
+        <w:t>The same weighted rubric compares Texas, Québec and Helsinki; demand proximity carries the largest weight at 25%. In the modeled demand distribution, Texas places 62.3% of addressable demand inside a 50 ms round trip, versus 50.7% for Québec and 19.5% for Helsinki. This explains the score advantage, while the table remains a reference-site comparison rather than a final property decision.</w:t>
       </w:r>
     </w:p>
     <w:tbl>
@@ -334,68 +334,12 @@
         <w:pStyle w:val="Heading1"/>
       </w:pPr>
       <w:r>
-        <w:t>Reference design</w:t>
+        <w:t>2. Design: the grid and resilience set the gate</w:t>
       </w:r>
     </w:p>
     <w:p>
       <w:r>
-        <w:t>The planning baseline is 20 MW of IT demand at a PUE of 1.25, producing 25 MW of total facility demand. At 8,760 operating hours, the calculated annual energy requirement is 219 GWh. The major design choice is closed-loop, non-evaporative cooling. The electrical concept includes protected distribution, UPS ride-through and backup generation. A 48-hour grid outage at full facility demand would require 1,200 MWh of delivered energy before any load shedding. The fuel plan, emissions permits and actual redundancy topology need engineering work.</w:t>
-      </w:r>
-    </w:p>
-    <w:p>
-      <w:pPr>
-        <w:pStyle w:val="Heading1"/>
-      </w:pPr>
-      <w:r>
-        <w:t>Conditions for the next gate</w:t>
-      </w:r>
-    </w:p>
-    <w:p>
-      <w:pPr>
-        <w:pStyle w:val="ListBullet"/>
-      </w:pPr>
-      <w:r>
-        <w:t>Obtain a written utility energization timeline and the full connection cost for a specific property.</w:t>
-      </w:r>
-    </w:p>
-    <w:p>
-      <w:pPr>
-        <w:pStyle w:val="ListBullet"/>
-      </w:pPr>
-      <w:r>
-        <w:t>Confirm applicable large-load rules, curtailment obligations and operating flexibility.</w:t>
-      </w:r>
-    </w:p>
-    <w:p>
-      <w:pPr>
-        <w:pStyle w:val="ListBullet"/>
-      </w:pPr>
-      <w:r>
-        <w:t>Complete the site-specific resilience, backup-power and refuelling studies.</w:t>
-      </w:r>
-    </w:p>
-    <w:p>
-      <w:pPr>
-        <w:pStyle w:val="ListBullet"/>
-      </w:pPr>
-      <w:r>
-        <w:t>Preserve the closed-loop cooling requirement through vendor design and permitting.</w:t>
-      </w:r>
-    </w:p>
-    <w:p>
-      <w:pPr>
-        <w:pStyle w:val="ListBullet"/>
-      </w:pPr>
-      <w:r>
-        <w:t>Agree a procurement plan for electricity and carbon attributes that member institutions can accept.</w:t>
-      </w:r>
-    </w:p>
-    <w:p>
-      <w:pPr>
-        <w:pStyle w:val="ListBullet"/>
-      </w:pPr>
-      <w:r>
-        <w:t>Secure member demand commitments and a capacity policy that protects smaller institutions.</w:t>
+        <w:t>The planning baseline is 20 MW of IT demand at a PUE of 1.25, producing 25 MW of total facility demand. At 8,760 operating hours, the calculated annual energy requirement is 219 GWh. The major design choice is closed-loop, non-evaporative cooling. The electrical concept includes protected distribution, UPS ride-through and backup generation. A 48-hour outage at full facility demand implies 1,200 MWh of delivered backup energy before load shedding; the fuel plan, emissions permits and redundancy topology therefore require site-specific engineering.</w:t>
       </w:r>
     </w:p>
     <w:p>
@@ -404,17 +348,17 @@
         <w:pageBreakBefore/>
       </w:pPr>
       <w:r>
-        <w:t>Investment path</w:t>
+        <w:t>3. Investment: stage capital against evidence</w:t>
       </w:r>
     </w:p>
     <w:p>
       <w:r>
-        <w:t>Build-and-own, lease and phased hybrid structures are available for comparison in the decision explorer. Its editable example demonstrates how power price, utilization, PUE and grid delay affect cash before opening, annual operating cost, cost per productive GPU-hour and capital at risk. The example inputs are scenario assumptions. Vendor quotes, financing terms, replacement schedules and contracted workloads are required before the committee can use a ten-year cash flow to approve capital.</w:t>
+        <w:t>Build-and-own, lease and phased hybrid structures are available for comparison in the decision explorer. The editable example assumes six months to grid energization; its delay stress adds a further year. It shows how power price, utilization, PUE and delay affect pre-opening cash, operating cost, cost per productive GPU-hour and capital at risk. This is a sensitivity tool, not a capital approval case: vendor prices, financing terms, replacement schedules and contracted workloads must replace scenario inputs.</w:t>
       </w:r>
     </w:p>
     <w:p>
       <w:r>
-        <w:t>Development equity should fund the utility study, site control, demand survey and early design. Construction debt follows a connection agreement, priced scope, permits and committed demand. Equipment financing follows GPU procurement terms and operating service levels.</w:t>
+        <w:t>Development equity funds the utility study, site control, member-demand survey and early design. Construction debt should follow a connection agreement, priced scope, permits and committed demand. Equipment financing should follow GPU procurement terms and defined operating service levels.</w:t>
       </w:r>
     </w:p>
     <w:p>
@@ -422,12 +366,44 @@
         <w:pStyle w:val="Heading1"/>
       </w:pPr>
       <w:r>
-        <w:t>What would reverse the recommendation</w:t>
+        <w:t>4. Conditions and reversal tests</w:t>
+      </w:r>
+    </w:p>
+    <w:p>
+      <w:pPr>
+        <w:pStyle w:val="ListBullet"/>
+      </w:pPr>
+      <w:r>
+        <w:t>Get a written energization date and full connection cost for a specific Texas property; confirm large-load rules and curtailment terms.</w:t>
+      </w:r>
+    </w:p>
+    <w:p>
+      <w:pPr>
+        <w:pStyle w:val="ListBullet"/>
+      </w:pPr>
+      <w:r>
+        <w:t>Complete resilience, backup-power, refuelling and closed-loop cooling engineering with permitting implications.</w:t>
+      </w:r>
+    </w:p>
+    <w:p>
+      <w:pPr>
+        <w:pStyle w:val="ListBullet"/>
+      </w:pPr>
+      <w:r>
+        <w:t>Secure member demand commitments, a capacity policy and an acceptable power and carbon-attribute procurement plan.</w:t>
+      </w:r>
+    </w:p>
+    <w:p>
+      <w:pPr>
+        <w:pStyle w:val="ListBullet"/>
+      </w:pPr>
+      <w:r>
+        <w:t>Obtain comparable priced build, lease and hybrid offers with financing and equipment replacement assumptions.</w:t>
       </w:r>
     </w:p>
     <w:p>
       <w:r>
-        <w:t>A materially earlier Québec connection paired with a durable delivered power rate could change the site result. So could a member workload mix dominated by batch training, stronger East Coast latency needs, or Texas interconnection terms that reduce availability or increase cost. The committee should revisit the same rubric when those answers arrive.</w:t>
+        <w:t>Re-run the site rubric if Québec offers a materially earlier connection and durable delivered power rate, if member workloads favor batch training or East Coast latency, or if Texas interconnection terms weaken availability or economics. These are decision-changing tests, not reasons to commit capital now.</w:t>
       </w:r>
     </w:p>
     <w:p>
@@ -435,12 +411,12 @@
         <w:pStyle w:val="Heading1"/>
       </w:pPr>
       <w:r>
-        <w:t>Next action</w:t>
+        <w:t>Conclusion and recommendation</w:t>
       </w:r>
     </w:p>
     <w:p>
       <w:r>
-        <w:t>Commission the utility and member-demand work, obtain priced build and lease proposals, and return to the committee with a site-specific gate package. Keep the Texas reference design as the base case while the alternative locations remain live comparators.</w:t>
+        <w:t>Approve the bounded utility, site and member-demand diligence package. Keep Texas as the base case and Québec and Helsinki as live comparators. The project team should return with a property-specific grid and resilience design, member commitments and comparable priced delivery offers before requesting construction or equipment capital.</w:t>
       </w:r>
     </w:p>
     <w:sectPr>

</xml_diff>

<commit_message>
Phase 10: regenerate memo and deck from the app's model
- scripts/export-model.mjs writes deliverables/model-results.json by
  running the app's own model code against the seeded database
- Memo rebuilt with Codex's script: one-year delay and half-utilization
  table with all four outputs, governance, three findings, uptime data
- Deck rebuilt with scripts/build-presentation.py, a python-pptx port of
  the Codex-runtime script (same slides, wording, layout and notes)
- Traceability updated for the regenerated documents

Co-Authored-By: Claude Opus 5.5 <noreply@anthropic.com>
</commit_message>
<xml_diff>
--- a/deliverables/University_AI_Data_Center_Decision_Memo.docx
+++ b/deliverables/University_AI_Data_Center_Decision_Memo.docx
@@ -7,62 +7,18 @@
         <w:pStyle w:val="Title"/>
       </w:pPr>
       <w:r>
-        <w:t>Shared University AI Data Center Decision Memo</w:t>
+        <w:t>Shared University AI Infrastructure Decision Memo</w:t>
       </w:r>
     </w:p>
     <w:p>
-      <w:pPr>
-        <w:spacing w:after="280"/>
-      </w:pPr>
       <w:r>
-        <w:rPr>
-          <w:b/>
-        </w:rPr>
-        <w:t xml:space="preserve">To: </w:t>
-      </w:r>
-      <w:r>
-        <w:t>University investment committee</w:t>
-      </w:r>
-      <w:r>
-        <w:br/>
-      </w:r>
-      <w:r>
-        <w:rPr>
-          <w:b/>
-        </w:rPr>
-        <w:t xml:space="preserve">From: </w:t>
-      </w:r>
-      <w:r>
-        <w:t>Project team</w:t>
-      </w:r>
-      <w:r>
-        <w:br/>
-      </w:r>
-      <w:r>
-        <w:rPr>
-          <w:b/>
-        </w:rPr>
-        <w:t xml:space="preserve">Date: </w:t>
-      </w:r>
-      <w:r>
-        <w:t>October 6, 2026</w:t>
-      </w:r>
-      <w:r>
-        <w:br/>
-      </w:r>
-      <w:r>
-        <w:rPr>
-          <w:b/>
-        </w:rPr>
-        <w:t xml:space="preserve">Subject: </w:t>
-      </w:r>
-      <w:r>
-        <w:t>Texas reference site and next funding gate</w:t>
+        <w:t>To: University investment committee   From: Project team   Date: October 6 2026</w:t>
       </w:r>
     </w:p>
     <w:p>
       <w:pPr>
         <w:pStyle w:val="Heading1"/>
+        <w:pageBreakBefore w:val="0"/>
       </w:pPr>
       <w:r>
         <w:t>Executive summary</w:t>
@@ -70,276 +26,49 @@
     </w:p>
     <w:p>
       <w:r>
-        <w:t>The committee is considering a shared AI data center for university members. We recommend Texas as the reference location and authorization of a bounded diligence stage, not construction or equipment procurement. Texas leads the weighted site comparison (3.60 versus 3.05 for Québec and Helsinki), chiefly because it reaches more of the modeled member demand within the 50 ms threshold. The 20 MW IT reference design implies 25 MW at the facility and 219 GWh of annual electricity demand. That scale makes grid timing, power terms, resilience and contracted member demand decisive. Return for a capital decision only with a written utility schedule and cost, site-specific engineering, member commitments and priced delivery options.</w:t>
+        <w:t>We recommend sending the full 25 MW build back for evidence while approving bounded diligence and competitively priced leased access. Retain a phased hybrid as the preferred expansion path. The brief establishes interest but no signed long-term commitments and no firm grid price or energization date. Texas leads the site rubric, but that does not establish that 25 MW is justified. Lease first to measure productive use, then release owned capacity against signed demand, a priced utility agreement and a validated resilience design. The ten-year comparisons make early ownership and unused-capacity costs explicit.</w:t>
       </w:r>
     </w:p>
     <w:p>
       <w:pPr>
         <w:pStyle w:val="Heading1"/>
+        <w:pageBreakBefore w:val="0"/>
       </w:pPr>
       <w:r>
-        <w:t>1. Site selection: proximity gives Texas the lead</w:t>
+        <w:t>Demand and location</w:t>
       </w:r>
     </w:p>
     <w:p>
       <w:r>
-        <w:t>The same weighted rubric compares Texas, Québec and Helsinki; demand proximity carries the largest weight at 25%. In the modeled demand distribution, Texas places 62.3% of addressable demand inside a 50 ms round trip, versus 50.7% for Québec and 19.5% for Helsinki. This explains the score advantage, while the table remains a reference-site comparison rather than a final property decision.</w:t>
+        <w:t>The planning case assumes 12,000 GPUs, 65% productive utilization and 99.5% availability, or 67.99 million productive GPU-hours per full operating year. These are assumptions, not orders. Survey training-cluster sizes, teaching timetables, inference demand, security needs and existing capacity before choosing scale. Texas scores 3.60/5 versus 3.05 for Québec and Helsinki. Demand proximity contributes 25% of the rubric; modeled demand within 50 ms is 62.3%, 50.7% and 19.5%, respectively. Validate campus-specific latency rather than treating city proxies as commitments.</w:t>
       </w:r>
     </w:p>
-    <w:tbl>
-      <w:tblPr>
-        <w:tblStyle w:val="TableGrid"/>
-        <w:tblW w:type="auto" w:w="0"/>
-        <w:jc w:val="center"/>
-        <w:tblLook w:firstColumn="1" w:firstRow="1" w:lastColumn="0" w:lastRow="0" w:noHBand="0" w:noVBand="1" w:val="04A0"/>
-      </w:tblPr>
-      <w:tblGrid>
-        <w:gridCol w:w="3216"/>
-        <w:gridCol w:w="3216"/>
-        <w:gridCol w:w="3216"/>
-      </w:tblGrid>
-      <w:tr>
-        <w:tc>
-          <w:tcPr>
-            <w:tcW w:type="dxa" w:w="3216"/>
-            <w:vAlign w:val="center"/>
-            <w:shd w:fill="153747"/>
-          </w:tcPr>
-          <w:p>
-            <w:pPr>
-              <w:spacing w:after="0" w:before="60"/>
-            </w:pPr>
-            <w:r>
-              <w:rPr>
-                <w:b/>
-                <w:color w:val="FFFFFF"/>
-                <w:sz w:val="19"/>
-              </w:rPr>
-              <w:t>Reference site</w:t>
-            </w:r>
-          </w:p>
-        </w:tc>
-        <w:tc>
-          <w:tcPr>
-            <w:tcW w:type="dxa" w:w="3216"/>
-            <w:vAlign w:val="center"/>
-            <w:shd w:fill="153747"/>
-          </w:tcPr>
-          <w:p>
-            <w:pPr>
-              <w:spacing w:after="0" w:before="60"/>
-            </w:pPr>
-            <w:r>
-              <w:rPr>
-                <w:b/>
-                <w:color w:val="FFFFFF"/>
-                <w:sz w:val="19"/>
-              </w:rPr>
-              <w:t>Weighted score</w:t>
-            </w:r>
-          </w:p>
-        </w:tc>
-        <w:tc>
-          <w:tcPr>
-            <w:tcW w:type="dxa" w:w="3216"/>
-            <w:vAlign w:val="center"/>
-            <w:shd w:fill="153747"/>
-          </w:tcPr>
-          <w:p>
-            <w:pPr>
-              <w:spacing w:after="0" w:before="60"/>
-            </w:pPr>
-            <w:r>
-              <w:rPr>
-                <w:b/>
-                <w:color w:val="FFFFFF"/>
-                <w:sz w:val="19"/>
-              </w:rPr>
-              <w:t>Demand within 50 ms</w:t>
-            </w:r>
-          </w:p>
-        </w:tc>
-      </w:tr>
-      <w:tr>
-        <w:tc>
-          <w:tcPr>
-            <w:tcW w:type="dxa" w:w="3216"/>
-            <w:vAlign w:val="center"/>
-            <w:shd w:fill="FFFFFF"/>
-          </w:tcPr>
-          <w:p>
-            <w:pPr>
-              <w:spacing w:after="0" w:before="60"/>
-            </w:pPr>
-            <w:r>
-              <w:rPr>
-                <w:sz w:val="19"/>
-              </w:rPr>
-              <w:t>Texas, United States</w:t>
-            </w:r>
-          </w:p>
-        </w:tc>
-        <w:tc>
-          <w:tcPr>
-            <w:tcW w:type="dxa" w:w="3216"/>
-            <w:vAlign w:val="center"/>
-            <w:shd w:fill="FFFFFF"/>
-          </w:tcPr>
-          <w:p>
-            <w:pPr>
-              <w:spacing w:after="0" w:before="60"/>
-            </w:pPr>
-            <w:r>
-              <w:rPr>
-                <w:sz w:val="19"/>
-              </w:rPr>
-              <w:t>3.60</w:t>
-            </w:r>
-          </w:p>
-        </w:tc>
-        <w:tc>
-          <w:tcPr>
-            <w:tcW w:type="dxa" w:w="3216"/>
-            <w:vAlign w:val="center"/>
-            <w:shd w:fill="FFFFFF"/>
-          </w:tcPr>
-          <w:p>
-            <w:pPr>
-              <w:spacing w:after="0" w:before="60"/>
-            </w:pPr>
-            <w:r>
-              <w:rPr>
-                <w:sz w:val="19"/>
-              </w:rPr>
-              <w:t>62.3%</w:t>
-            </w:r>
-          </w:p>
-        </w:tc>
-      </w:tr>
-      <w:tr>
-        <w:tc>
-          <w:tcPr>
-            <w:tcW w:type="dxa" w:w="3216"/>
-            <w:vAlign w:val="center"/>
-            <w:shd w:fill="F0F5F5"/>
-          </w:tcPr>
-          <w:p>
-            <w:pPr>
-              <w:spacing w:after="0" w:before="60"/>
-            </w:pPr>
-            <w:r>
-              <w:rPr>
-                <w:sz w:val="19"/>
-              </w:rPr>
-              <w:t>Québec, Canada</w:t>
-            </w:r>
-          </w:p>
-        </w:tc>
-        <w:tc>
-          <w:tcPr>
-            <w:tcW w:type="dxa" w:w="3216"/>
-            <w:vAlign w:val="center"/>
-            <w:shd w:fill="F0F5F5"/>
-          </w:tcPr>
-          <w:p>
-            <w:pPr>
-              <w:spacing w:after="0" w:before="60"/>
-            </w:pPr>
-            <w:r>
-              <w:rPr>
-                <w:sz w:val="19"/>
-              </w:rPr>
-              <w:t>3.05</w:t>
-            </w:r>
-          </w:p>
-        </w:tc>
-        <w:tc>
-          <w:tcPr>
-            <w:tcW w:type="dxa" w:w="3216"/>
-            <w:vAlign w:val="center"/>
-            <w:shd w:fill="F0F5F5"/>
-          </w:tcPr>
-          <w:p>
-            <w:pPr>
-              <w:spacing w:after="0" w:before="60"/>
-            </w:pPr>
-            <w:r>
-              <w:rPr>
-                <w:sz w:val="19"/>
-              </w:rPr>
-              <w:t>50.7%</w:t>
-            </w:r>
-          </w:p>
-        </w:tc>
-      </w:tr>
-      <w:tr>
-        <w:tc>
-          <w:tcPr>
-            <w:tcW w:type="dxa" w:w="3216"/>
-            <w:vAlign w:val="center"/>
-            <w:shd w:fill="FFFFFF"/>
-          </w:tcPr>
-          <w:p>
-            <w:pPr>
-              <w:spacing w:after="0" w:before="60"/>
-            </w:pPr>
-            <w:r>
-              <w:rPr>
-                <w:sz w:val="19"/>
-              </w:rPr>
-              <w:t>Helsinki, Finland</w:t>
-            </w:r>
-          </w:p>
-        </w:tc>
-        <w:tc>
-          <w:tcPr>
-            <w:tcW w:type="dxa" w:w="3216"/>
-            <w:vAlign w:val="center"/>
-            <w:shd w:fill="FFFFFF"/>
-          </w:tcPr>
-          <w:p>
-            <w:pPr>
-              <w:spacing w:after="0" w:before="60"/>
-            </w:pPr>
-            <w:r>
-              <w:rPr>
-                <w:sz w:val="19"/>
-              </w:rPr>
-              <w:t>3.05</w:t>
-            </w:r>
-          </w:p>
-        </w:tc>
-        <w:tc>
-          <w:tcPr>
-            <w:tcW w:type="dxa" w:w="3216"/>
-            <w:vAlign w:val="center"/>
-            <w:shd w:fill="FFFFFF"/>
-          </w:tcPr>
-          <w:p>
-            <w:pPr>
-              <w:spacing w:after="0" w:before="60"/>
-            </w:pPr>
-            <w:r>
-              <w:rPr>
-                <w:sz w:val="19"/>
-              </w:rPr>
-              <w:t>19.5%</w:t>
-            </w:r>
-          </w:p>
-        </w:tc>
-      </w:tr>
-    </w:tbl>
     <w:p>
       <w:pPr>
         <w:pStyle w:val="Heading1"/>
+        <w:pageBreakBefore w:val="0"/>
       </w:pPr>
       <w:r>
-        <w:t>2. Design: the grid and resilience set the gate</w:t>
+        <w:t>Technical concept and external effects</w:t>
       </w:r>
     </w:p>
     <w:p>
       <w:r>
-        <w:t>The planning baseline is 20 MW of IT demand at a PUE of 1.25, producing 25 MW of total facility demand. At 8,760 operating hours, the calculated annual energy requirement is 219 GWh. The major design choice is closed-loop, non-evaporative cooling. The electrical concept includes protected distribution, UPS ride-through and backup generation. A 48-hour outage at full facility demand implies 1,200 MWh of delivered backup energy before load shedding; the fuel plan, emissions permits and redundancy topology therefore require site-specific engineering.</w:t>
+        <w:t>The reference design is 20 MW IT at PUE 1.25: 25 MW total site demand and 219 GWh/year. It includes protected distribution, UPS ride-through, standby generation, closed-loop non-evaporative cooling, diverse networking and checkpoint storage. Isolation and remaining capacity must sustain critical load after the largest component fails; otherwise shed lower-priority workloads. A 48-hour grid outage requires 1,200 MWh at full facility load, with fuel and refuelling matched to that duty. Renewable contracts receive no firm outage credit without hourly delivery evidence. Check drought exposure, noise, emissions, grid-upgrade allocation and effects on other customers before permitting.</w:t>
+      </w:r>
+    </w:p>
+    <w:p>
+      <w:pPr>
+        <w:pStyle w:val="Heading1"/>
+        <w:pageBreakBefore w:val="0"/>
+      </w:pPr>
+      <w:r>
+        <w:t>Ownership governance and financing</w:t>
+      </w:r>
+    </w:p>
+    <w:p>
+      <w:r>
+        <w:t>The consortium should own any approved facility and its data-access policy, and contract construction, utility supply, specialist maintenance and overflow compute. A representative board sets prices and admits members; a scientific panel resolves research and teaching conflicts. Proposed policy reserves 20% for small institutions and teaching, caps one member at 35% of discretionary capacity, releases unused reservations, and charges fixed costs by reservation and variable costs by metered use. Seek development equity for bounded studies; require grid terms, permits and demand before construction debt, then equipment terms and service levels before GPU financing. Sponsors carry delay risk until contractually transferred. Withdrawal requires replacement demand or payment of unrecovered commitments.</w:t>
       </w:r>
     </w:p>
     <w:p>
@@ -348,67 +77,1741 @@
         <w:pageBreakBefore/>
       </w:pPr>
       <w:r>
-        <w:t>3. Investment: stage capital against evidence</w:t>
+        <w:t>Ten year economics and required stress cases</w:t>
       </w:r>
     </w:p>
     <w:p>
       <w:r>
-        <w:t>Build-and-own, lease and phased hybrid structures are available for comparison in the decision explorer. The editable example assumes 0.5 months (about two weeks) to grid energization; its delay stress adds three months. It shows how power price, utilization, PUE and delay affect pre-opening cash, operating cost, cost per productive GPU-hour and capital at risk. This is a sensitivity tool, not a capital approval case: vendor prices, financing terms, replacement schedules and contracted workloads must replace scenario inputs.</w:t>
+        <w:t>All figures below are planning calculations in nominal USD. Build capital of $480.0m separates facility $200.0m, grid $30.0m, land $10.0m and GPUs $240.0m. The model includes electricity, staff, maintenance, other operations, debt interest, replacement every 4 years and member charges. Productive-hour cost includes ten-year cost and opening delays. NPV uses a 8% discount rate.</w:t>
       </w:r>
     </w:p>
+    <w:tbl>
+      <w:tblPr>
+        <w:tblW w:type="auto" w:w="0"/>
+        <w:jc w:val="center"/>
+        <w:tblLayout w:type="fixed"/>
+        <w:tblLook w:firstColumn="1" w:firstRow="1" w:lastColumn="0" w:lastRow="0" w:noHBand="0" w:noVBand="1" w:val="04A0"/>
+      </w:tblPr>
+      <w:tblGrid>
+        <w:gridCol w:w="2952"/>
+        <w:gridCol w:w="1728"/>
+        <w:gridCol w:w="1613"/>
+        <w:gridCol w:w="1570"/>
+        <w:gridCol w:w="2189"/>
+      </w:tblGrid>
+      <w:tr>
+        <w:trPr>
+          <w:tblHeader/>
+        </w:trPr>
+        <w:tc>
+          <w:tcPr>
+            <w:tcW w:type="dxa" w:w="2952"/>
+            <w:vAlign w:val="center"/>
+            <w:shd w:fill="153747"/>
+            <w:tcMar>
+              <w:top w:w="60" w:type="dxa"/>
+              <w:bottom w:w="60" w:type="dxa"/>
+              <w:left w:w="60" w:type="dxa"/>
+              <w:right w:w="60" w:type="dxa"/>
+            </w:tcMar>
+            <w:tcBorders>
+              <w:top w:val="single" w:sz="4" w:color="D9D9D9"/>
+              <w:bottom w:val="single" w:sz="4" w:color="D9D9D9"/>
+              <w:left w:val="single" w:sz="4" w:color="D9D9D9"/>
+              <w:right w:val="single" w:sz="4" w:color="D9D9D9"/>
+            </w:tcBorders>
+          </w:tcPr>
+          <w:p>
+            <w:pPr>
+              <w:spacing w:after="0" w:line="245" w:lineRule="auto"/>
+            </w:pPr>
+            <w:r>
+              <w:rPr>
+                <w:b/>
+                <w:color w:val="FFFFFF"/>
+                <w:sz w:val="17"/>
+              </w:rPr>
+              <w:t>Case and path</w:t>
+            </w:r>
+          </w:p>
+        </w:tc>
+        <w:tc>
+          <w:tcPr>
+            <w:tcW w:type="dxa" w:w="1728"/>
+            <w:vAlign w:val="center"/>
+            <w:shd w:fill="153747"/>
+            <w:tcMar>
+              <w:top w:w="60" w:type="dxa"/>
+              <w:bottom w:w="60" w:type="dxa"/>
+              <w:left w:w="60" w:type="dxa"/>
+              <w:right w:w="60" w:type="dxa"/>
+            </w:tcMar>
+            <w:tcBorders>
+              <w:top w:val="single" w:sz="4" w:color="D9D9D9"/>
+              <w:bottom w:val="single" w:sz="4" w:color="D9D9D9"/>
+              <w:left w:val="single" w:sz="4" w:color="D9D9D9"/>
+              <w:right w:val="single" w:sz="4" w:color="D9D9D9"/>
+            </w:tcBorders>
+          </w:tcPr>
+          <w:p>
+            <w:pPr>
+              <w:spacing w:after="0" w:line="245" w:lineRule="auto"/>
+              <w:jc w:val="right"/>
+            </w:pPr>
+            <w:r>
+              <w:rPr>
+                <w:b/>
+                <w:color w:val="FFFFFF"/>
+                <w:sz w:val="17"/>
+              </w:rPr>
+              <w:t>Cash before</w:t>
+              <w:br/>
+              <w:t>opening</w:t>
+            </w:r>
+          </w:p>
+        </w:tc>
+        <w:tc>
+          <w:tcPr>
+            <w:tcW w:type="dxa" w:w="1613"/>
+            <w:vAlign w:val="center"/>
+            <w:shd w:fill="153747"/>
+            <w:tcMar>
+              <w:top w:w="60" w:type="dxa"/>
+              <w:bottom w:w="60" w:type="dxa"/>
+              <w:left w:w="60" w:type="dxa"/>
+              <w:right w:w="60" w:type="dxa"/>
+            </w:tcMar>
+            <w:tcBorders>
+              <w:top w:val="single" w:sz="4" w:color="D9D9D9"/>
+              <w:bottom w:val="single" w:sz="4" w:color="D9D9D9"/>
+              <w:left w:val="single" w:sz="4" w:color="D9D9D9"/>
+              <w:right w:val="single" w:sz="4" w:color="D9D9D9"/>
+            </w:tcBorders>
+          </w:tcPr>
+          <w:p>
+            <w:pPr>
+              <w:spacing w:after="0" w:line="245" w:lineRule="auto"/>
+              <w:jc w:val="right"/>
+            </w:pPr>
+            <w:r>
+              <w:rPr>
+                <w:b/>
+                <w:color w:val="FFFFFF"/>
+                <w:sz w:val="17"/>
+              </w:rPr>
+              <w:t>Annual</w:t>
+              <w:br/>
+              <w:t>operations</w:t>
+            </w:r>
+          </w:p>
+        </w:tc>
+        <w:tc>
+          <w:tcPr>
+            <w:tcW w:type="dxa" w:w="1570"/>
+            <w:vAlign w:val="center"/>
+            <w:shd w:fill="153747"/>
+            <w:tcMar>
+              <w:top w:w="60" w:type="dxa"/>
+              <w:bottom w:w="60" w:type="dxa"/>
+              <w:left w:w="60" w:type="dxa"/>
+              <w:right w:w="60" w:type="dxa"/>
+            </w:tcMar>
+            <w:tcBorders>
+              <w:top w:val="single" w:sz="4" w:color="D9D9D9"/>
+              <w:bottom w:val="single" w:sz="4" w:color="D9D9D9"/>
+              <w:left w:val="single" w:sz="4" w:color="D9D9D9"/>
+              <w:right w:val="single" w:sz="4" w:color="D9D9D9"/>
+            </w:tcBorders>
+          </w:tcPr>
+          <w:p>
+            <w:pPr>
+              <w:spacing w:after="0" w:line="245" w:lineRule="auto"/>
+              <w:jc w:val="right"/>
+            </w:pPr>
+            <w:r>
+              <w:rPr>
+                <w:b/>
+                <w:color w:val="FFFFFF"/>
+                <w:sz w:val="17"/>
+              </w:rPr>
+              <w:t>Cost per</w:t>
+              <w:br/>
+              <w:t>GPU hour</w:t>
+            </w:r>
+          </w:p>
+        </w:tc>
+        <w:tc>
+          <w:tcPr>
+            <w:tcW w:type="dxa" w:w="2189"/>
+            <w:vAlign w:val="center"/>
+            <w:shd w:fill="153747"/>
+            <w:tcMar>
+              <w:top w:w="60" w:type="dxa"/>
+              <w:bottom w:w="60" w:type="dxa"/>
+              <w:left w:w="60" w:type="dxa"/>
+              <w:right w:w="60" w:type="dxa"/>
+            </w:tcMar>
+            <w:tcBorders>
+              <w:top w:val="single" w:sz="4" w:color="D9D9D9"/>
+              <w:bottom w:val="single" w:sz="4" w:color="D9D9D9"/>
+              <w:left w:val="single" w:sz="4" w:color="D9D9D9"/>
+              <w:right w:val="single" w:sz="4" w:color="D9D9D9"/>
+            </w:tcBorders>
+          </w:tcPr>
+          <w:p>
+            <w:pPr>
+              <w:spacing w:after="0" w:line="245" w:lineRule="auto"/>
+              <w:jc w:val="right"/>
+            </w:pPr>
+            <w:r>
+              <w:rPr>
+                <w:b/>
+                <w:color w:val="FFFFFF"/>
+                <w:sz w:val="17"/>
+              </w:rPr>
+              <w:t>Capital</w:t>
+              <w:br/>
+              <w:t>at risk</w:t>
+            </w:r>
+          </w:p>
+        </w:tc>
+      </w:tr>
+      <w:tr>
+        <w:tc>
+          <w:tcPr>
+            <w:tcW w:type="dxa" w:w="2952"/>
+            <w:vAlign w:val="center"/>
+            <w:shd w:fill="FFFFFF"/>
+            <w:tcMar>
+              <w:top w:w="60" w:type="dxa"/>
+              <w:bottom w:w="60" w:type="dxa"/>
+              <w:left w:w="60" w:type="dxa"/>
+              <w:right w:w="60" w:type="dxa"/>
+            </w:tcMar>
+            <w:tcBorders>
+              <w:top w:val="single" w:sz="4" w:color="D9D9D9"/>
+              <w:bottom w:val="single" w:sz="4" w:color="D9D9D9"/>
+              <w:left w:val="single" w:sz="4" w:color="D9D9D9"/>
+              <w:right w:val="single" w:sz="4" w:color="D9D9D9"/>
+            </w:tcBorders>
+          </w:tcPr>
+          <w:p>
+            <w:pPr>
+              <w:spacing w:after="0" w:line="245" w:lineRule="auto"/>
+            </w:pPr>
+            <w:r>
+              <w:rPr>
+                <w:b w:val="0"/>
+                <w:color w:val="000000"/>
+                <w:sz w:val="17"/>
+              </w:rPr>
+              <w:t>Base / Build</w:t>
+            </w:r>
+          </w:p>
+        </w:tc>
+        <w:tc>
+          <w:tcPr>
+            <w:tcW w:type="dxa" w:w="1728"/>
+            <w:vAlign w:val="center"/>
+            <w:shd w:fill="FFFFFF"/>
+            <w:tcMar>
+              <w:top w:w="60" w:type="dxa"/>
+              <w:bottom w:w="60" w:type="dxa"/>
+              <w:left w:w="60" w:type="dxa"/>
+              <w:right w:w="60" w:type="dxa"/>
+            </w:tcMar>
+            <w:tcBorders>
+              <w:top w:val="single" w:sz="4" w:color="D9D9D9"/>
+              <w:bottom w:val="single" w:sz="4" w:color="D9D9D9"/>
+              <w:left w:val="single" w:sz="4" w:color="D9D9D9"/>
+              <w:right w:val="single" w:sz="4" w:color="D9D9D9"/>
+            </w:tcBorders>
+          </w:tcPr>
+          <w:p>
+            <w:pPr>
+              <w:spacing w:after="0" w:line="245" w:lineRule="auto"/>
+              <w:jc w:val="right"/>
+            </w:pPr>
+            <w:r>
+              <w:rPr>
+                <w:b w:val="0"/>
+                <w:color w:val="000000"/>
+                <w:sz w:val="17"/>
+              </w:rPr>
+              <w:t>$489.0m</w:t>
+            </w:r>
+          </w:p>
+        </w:tc>
+        <w:tc>
+          <w:tcPr>
+            <w:tcW w:type="dxa" w:w="1613"/>
+            <w:vAlign w:val="center"/>
+            <w:shd w:fill="FFFFFF"/>
+            <w:tcMar>
+              <w:top w:w="60" w:type="dxa"/>
+              <w:bottom w:w="60" w:type="dxa"/>
+              <w:left w:w="60" w:type="dxa"/>
+              <w:right w:w="60" w:type="dxa"/>
+            </w:tcMar>
+            <w:tcBorders>
+              <w:top w:val="single" w:sz="4" w:color="D9D9D9"/>
+              <w:bottom w:val="single" w:sz="4" w:color="D9D9D9"/>
+              <w:left w:val="single" w:sz="4" w:color="D9D9D9"/>
+              <w:right w:val="single" w:sz="4" w:color="D9D9D9"/>
+            </w:tcBorders>
+          </w:tcPr>
+          <w:p>
+            <w:pPr>
+              <w:spacing w:after="0" w:line="245" w:lineRule="auto"/>
+              <w:jc w:val="right"/>
+            </w:pPr>
+            <w:r>
+              <w:rPr>
+                <w:b w:val="0"/>
+                <w:color w:val="000000"/>
+                <w:sz w:val="17"/>
+              </w:rPr>
+              <w:t>$55.5m</w:t>
+            </w:r>
+          </w:p>
+        </w:tc>
+        <w:tc>
+          <w:tcPr>
+            <w:tcW w:type="dxa" w:w="1570"/>
+            <w:vAlign w:val="center"/>
+            <w:shd w:fill="FFFFFF"/>
+            <w:tcMar>
+              <w:top w:w="60" w:type="dxa"/>
+              <w:bottom w:w="60" w:type="dxa"/>
+              <w:left w:w="60" w:type="dxa"/>
+              <w:right w:w="60" w:type="dxa"/>
+            </w:tcMar>
+            <w:tcBorders>
+              <w:top w:val="single" w:sz="4" w:color="D9D9D9"/>
+              <w:bottom w:val="single" w:sz="4" w:color="D9D9D9"/>
+              <w:left w:val="single" w:sz="4" w:color="D9D9D9"/>
+              <w:right w:val="single" w:sz="4" w:color="D9D9D9"/>
+            </w:tcBorders>
+          </w:tcPr>
+          <w:p>
+            <w:pPr>
+              <w:spacing w:after="0" w:line="245" w:lineRule="auto"/>
+              <w:jc w:val="right"/>
+            </w:pPr>
+            <w:r>
+              <w:rPr>
+                <w:b w:val="0"/>
+                <w:color w:val="000000"/>
+                <w:sz w:val="17"/>
+              </w:rPr>
+              <w:t>$2.67</w:t>
+            </w:r>
+          </w:p>
+        </w:tc>
+        <w:tc>
+          <w:tcPr>
+            <w:tcW w:type="dxa" w:w="2189"/>
+            <w:vAlign w:val="center"/>
+            <w:shd w:fill="FFFFFF"/>
+            <w:tcMar>
+              <w:top w:w="60" w:type="dxa"/>
+              <w:bottom w:w="60" w:type="dxa"/>
+              <w:left w:w="60" w:type="dxa"/>
+              <w:right w:w="60" w:type="dxa"/>
+            </w:tcMar>
+            <w:tcBorders>
+              <w:top w:val="single" w:sz="4" w:color="D9D9D9"/>
+              <w:bottom w:val="single" w:sz="4" w:color="D9D9D9"/>
+              <w:left w:val="single" w:sz="4" w:color="D9D9D9"/>
+              <w:right w:val="single" w:sz="4" w:color="D9D9D9"/>
+            </w:tcBorders>
+          </w:tcPr>
+          <w:p>
+            <w:pPr>
+              <w:spacing w:after="0" w:line="245" w:lineRule="auto"/>
+              <w:jc w:val="right"/>
+            </w:pPr>
+            <w:r>
+              <w:rPr>
+                <w:b w:val="0"/>
+                <w:color w:val="000000"/>
+                <w:sz w:val="17"/>
+              </w:rPr>
+              <w:t>$420.2m</w:t>
+            </w:r>
+          </w:p>
+        </w:tc>
+      </w:tr>
+      <w:tr>
+        <w:tc>
+          <w:tcPr>
+            <w:tcW w:type="dxa" w:w="2952"/>
+            <w:vAlign w:val="center"/>
+            <w:shd w:fill="F1F5F5"/>
+            <w:tcMar>
+              <w:top w:w="60" w:type="dxa"/>
+              <w:bottom w:w="60" w:type="dxa"/>
+              <w:left w:w="60" w:type="dxa"/>
+              <w:right w:w="60" w:type="dxa"/>
+            </w:tcMar>
+            <w:tcBorders>
+              <w:top w:val="single" w:sz="4" w:color="D9D9D9"/>
+              <w:bottom w:val="single" w:sz="4" w:color="D9D9D9"/>
+              <w:left w:val="single" w:sz="4" w:color="D9D9D9"/>
+              <w:right w:val="single" w:sz="4" w:color="D9D9D9"/>
+            </w:tcBorders>
+          </w:tcPr>
+          <w:p>
+            <w:pPr>
+              <w:spacing w:after="0" w:line="245" w:lineRule="auto"/>
+            </w:pPr>
+            <w:r>
+              <w:rPr>
+                <w:b w:val="0"/>
+                <w:color w:val="000000"/>
+                <w:sz w:val="17"/>
+              </w:rPr>
+              <w:t>Base / Lease</w:t>
+            </w:r>
+          </w:p>
+        </w:tc>
+        <w:tc>
+          <w:tcPr>
+            <w:tcW w:type="dxa" w:w="1728"/>
+            <w:vAlign w:val="center"/>
+            <w:shd w:fill="F1F5F5"/>
+            <w:tcMar>
+              <w:top w:w="60" w:type="dxa"/>
+              <w:bottom w:w="60" w:type="dxa"/>
+              <w:left w:w="60" w:type="dxa"/>
+              <w:right w:w="60" w:type="dxa"/>
+            </w:tcMar>
+            <w:tcBorders>
+              <w:top w:val="single" w:sz="4" w:color="D9D9D9"/>
+              <w:bottom w:val="single" w:sz="4" w:color="D9D9D9"/>
+              <w:left w:val="single" w:sz="4" w:color="D9D9D9"/>
+              <w:right w:val="single" w:sz="4" w:color="D9D9D9"/>
+            </w:tcBorders>
+          </w:tcPr>
+          <w:p>
+            <w:pPr>
+              <w:spacing w:after="0" w:line="245" w:lineRule="auto"/>
+              <w:jc w:val="right"/>
+            </w:pPr>
+            <w:r>
+              <w:rPr>
+                <w:b w:val="0"/>
+                <w:color w:val="000000"/>
+                <w:sz w:val="17"/>
+              </w:rPr>
+              <w:t>$0.0m</w:t>
+            </w:r>
+          </w:p>
+        </w:tc>
+        <w:tc>
+          <w:tcPr>
+            <w:tcW w:type="dxa" w:w="1613"/>
+            <w:vAlign w:val="center"/>
+            <w:shd w:fill="F1F5F5"/>
+            <w:tcMar>
+              <w:top w:w="60" w:type="dxa"/>
+              <w:bottom w:w="60" w:type="dxa"/>
+              <w:left w:w="60" w:type="dxa"/>
+              <w:right w:w="60" w:type="dxa"/>
+            </w:tcMar>
+            <w:tcBorders>
+              <w:top w:val="single" w:sz="4" w:color="D9D9D9"/>
+              <w:bottom w:val="single" w:sz="4" w:color="D9D9D9"/>
+              <w:left w:val="single" w:sz="4" w:color="D9D9D9"/>
+              <w:right w:val="single" w:sz="4" w:color="D9D9D9"/>
+            </w:tcBorders>
+          </w:tcPr>
+          <w:p>
+            <w:pPr>
+              <w:spacing w:after="0" w:line="245" w:lineRule="auto"/>
+              <w:jc w:val="right"/>
+            </w:pPr>
+            <w:r>
+              <w:rPr>
+                <w:b w:val="0"/>
+                <w:color w:val="000000"/>
+                <w:sz w:val="17"/>
+              </w:rPr>
+              <w:t>$92.0m</w:t>
+            </w:r>
+          </w:p>
+        </w:tc>
+        <w:tc>
+          <w:tcPr>
+            <w:tcW w:type="dxa" w:w="1570"/>
+            <w:vAlign w:val="center"/>
+            <w:shd w:fill="F1F5F5"/>
+            <w:tcMar>
+              <w:top w:w="60" w:type="dxa"/>
+              <w:bottom w:w="60" w:type="dxa"/>
+              <w:left w:w="60" w:type="dxa"/>
+              <w:right w:w="60" w:type="dxa"/>
+            </w:tcMar>
+            <w:tcBorders>
+              <w:top w:val="single" w:sz="4" w:color="D9D9D9"/>
+              <w:bottom w:val="single" w:sz="4" w:color="D9D9D9"/>
+              <w:left w:val="single" w:sz="4" w:color="D9D9D9"/>
+              <w:right w:val="single" w:sz="4" w:color="D9D9D9"/>
+            </w:tcBorders>
+          </w:tcPr>
+          <w:p>
+            <w:pPr>
+              <w:spacing w:after="0" w:line="245" w:lineRule="auto"/>
+              <w:jc w:val="right"/>
+            </w:pPr>
+            <w:r>
+              <w:rPr>
+                <w:b w:val="0"/>
+                <w:color w:val="000000"/>
+                <w:sz w:val="17"/>
+              </w:rPr>
+              <w:t>$1.50</w:t>
+            </w:r>
+          </w:p>
+        </w:tc>
+        <w:tc>
+          <w:tcPr>
+            <w:tcW w:type="dxa" w:w="2189"/>
+            <w:vAlign w:val="center"/>
+            <w:shd w:fill="F1F5F5"/>
+            <w:tcMar>
+              <w:top w:w="60" w:type="dxa"/>
+              <w:bottom w:w="60" w:type="dxa"/>
+              <w:left w:w="60" w:type="dxa"/>
+              <w:right w:w="60" w:type="dxa"/>
+            </w:tcMar>
+            <w:tcBorders>
+              <w:top w:val="single" w:sz="4" w:color="D9D9D9"/>
+              <w:bottom w:val="single" w:sz="4" w:color="D9D9D9"/>
+              <w:left w:val="single" w:sz="4" w:color="D9D9D9"/>
+              <w:right w:val="single" w:sz="4" w:color="D9D9D9"/>
+            </w:tcBorders>
+          </w:tcPr>
+          <w:p>
+            <w:pPr>
+              <w:spacing w:after="0" w:line="245" w:lineRule="auto"/>
+              <w:jc w:val="right"/>
+            </w:pPr>
+            <w:r>
+              <w:rPr>
+                <w:b w:val="0"/>
+                <w:color w:val="000000"/>
+                <w:sz w:val="17"/>
+              </w:rPr>
+              <w:t>$0.0m</w:t>
+            </w:r>
+          </w:p>
+        </w:tc>
+      </w:tr>
+      <w:tr>
+        <w:tc>
+          <w:tcPr>
+            <w:tcW w:type="dxa" w:w="2952"/>
+            <w:vAlign w:val="center"/>
+            <w:shd w:fill="FFFFFF"/>
+            <w:tcMar>
+              <w:top w:w="60" w:type="dxa"/>
+              <w:bottom w:w="60" w:type="dxa"/>
+              <w:left w:w="60" w:type="dxa"/>
+              <w:right w:w="60" w:type="dxa"/>
+            </w:tcMar>
+            <w:tcBorders>
+              <w:top w:val="single" w:sz="4" w:color="D9D9D9"/>
+              <w:bottom w:val="single" w:sz="4" w:color="D9D9D9"/>
+              <w:left w:val="single" w:sz="4" w:color="D9D9D9"/>
+              <w:right w:val="single" w:sz="4" w:color="D9D9D9"/>
+            </w:tcBorders>
+          </w:tcPr>
+          <w:p>
+            <w:pPr>
+              <w:spacing w:after="0" w:line="245" w:lineRule="auto"/>
+            </w:pPr>
+            <w:r>
+              <w:rPr>
+                <w:b w:val="0"/>
+                <w:color w:val="000000"/>
+                <w:sz w:val="17"/>
+              </w:rPr>
+              <w:t>Base / Hybrid</w:t>
+            </w:r>
+          </w:p>
+        </w:tc>
+        <w:tc>
+          <w:tcPr>
+            <w:tcW w:type="dxa" w:w="1728"/>
+            <w:vAlign w:val="center"/>
+            <w:shd w:fill="FFFFFF"/>
+            <w:tcMar>
+              <w:top w:w="60" w:type="dxa"/>
+              <w:bottom w:w="60" w:type="dxa"/>
+              <w:left w:w="60" w:type="dxa"/>
+              <w:right w:w="60" w:type="dxa"/>
+            </w:tcMar>
+            <w:tcBorders>
+              <w:top w:val="single" w:sz="4" w:color="D9D9D9"/>
+              <w:bottom w:val="single" w:sz="4" w:color="D9D9D9"/>
+              <w:left w:val="single" w:sz="4" w:color="D9D9D9"/>
+              <w:right w:val="single" w:sz="4" w:color="D9D9D9"/>
+            </w:tcBorders>
+          </w:tcPr>
+          <w:p>
+            <w:pPr>
+              <w:spacing w:after="0" w:line="245" w:lineRule="auto"/>
+              <w:jc w:val="right"/>
+            </w:pPr>
+            <w:r>
+              <w:rPr>
+                <w:b w:val="0"/>
+                <w:color w:val="000000"/>
+                <w:sz w:val="17"/>
+              </w:rPr>
+              <w:t>$550.7m</w:t>
+            </w:r>
+          </w:p>
+        </w:tc>
+        <w:tc>
+          <w:tcPr>
+            <w:tcW w:type="dxa" w:w="1613"/>
+            <w:vAlign w:val="center"/>
+            <w:shd w:fill="FFFFFF"/>
+            <w:tcMar>
+              <w:top w:w="60" w:type="dxa"/>
+              <w:bottom w:w="60" w:type="dxa"/>
+              <w:left w:w="60" w:type="dxa"/>
+              <w:right w:w="60" w:type="dxa"/>
+            </w:tcMar>
+            <w:tcBorders>
+              <w:top w:val="single" w:sz="4" w:color="D9D9D9"/>
+              <w:bottom w:val="single" w:sz="4" w:color="D9D9D9"/>
+              <w:left w:val="single" w:sz="4" w:color="D9D9D9"/>
+              <w:right w:val="single" w:sz="4" w:color="D9D9D9"/>
+            </w:tcBorders>
+          </w:tcPr>
+          <w:p>
+            <w:pPr>
+              <w:spacing w:after="0" w:line="245" w:lineRule="auto"/>
+              <w:jc w:val="right"/>
+            </w:pPr>
+            <w:r>
+              <w:rPr>
+                <w:b w:val="0"/>
+                <w:color w:val="000000"/>
+                <w:sz w:val="17"/>
+              </w:rPr>
+              <w:t>$75.8m</w:t>
+            </w:r>
+          </w:p>
+        </w:tc>
+        <w:tc>
+          <w:tcPr>
+            <w:tcW w:type="dxa" w:w="1570"/>
+            <w:vAlign w:val="center"/>
+            <w:shd w:fill="FFFFFF"/>
+            <w:tcMar>
+              <w:top w:w="60" w:type="dxa"/>
+              <w:bottom w:w="60" w:type="dxa"/>
+              <w:left w:w="60" w:type="dxa"/>
+              <w:right w:w="60" w:type="dxa"/>
+            </w:tcMar>
+            <w:tcBorders>
+              <w:top w:val="single" w:sz="4" w:color="D9D9D9"/>
+              <w:bottom w:val="single" w:sz="4" w:color="D9D9D9"/>
+              <w:left w:val="single" w:sz="4" w:color="D9D9D9"/>
+              <w:right w:val="single" w:sz="4" w:color="D9D9D9"/>
+            </w:tcBorders>
+          </w:tcPr>
+          <w:p>
+            <w:pPr>
+              <w:spacing w:after="0" w:line="245" w:lineRule="auto"/>
+              <w:jc w:val="right"/>
+            </w:pPr>
+            <w:r>
+              <w:rPr>
+                <w:b w:val="0"/>
+                <w:color w:val="000000"/>
+                <w:sz w:val="17"/>
+              </w:rPr>
+              <w:t>$1.83</w:t>
+            </w:r>
+          </w:p>
+        </w:tc>
+        <w:tc>
+          <w:tcPr>
+            <w:tcW w:type="dxa" w:w="2189"/>
+            <w:vAlign w:val="center"/>
+            <w:shd w:fill="FFFFFF"/>
+            <w:tcMar>
+              <w:top w:w="60" w:type="dxa"/>
+              <w:bottom w:w="60" w:type="dxa"/>
+              <w:left w:w="60" w:type="dxa"/>
+              <w:right w:w="60" w:type="dxa"/>
+            </w:tcMar>
+            <w:tcBorders>
+              <w:top w:val="single" w:sz="4" w:color="D9D9D9"/>
+              <w:bottom w:val="single" w:sz="4" w:color="D9D9D9"/>
+              <w:left w:val="single" w:sz="4" w:color="D9D9D9"/>
+              <w:right w:val="single" w:sz="4" w:color="D9D9D9"/>
+            </w:tcBorders>
+          </w:tcPr>
+          <w:p>
+            <w:pPr>
+              <w:spacing w:after="0" w:line="245" w:lineRule="auto"/>
+              <w:jc w:val="right"/>
+            </w:pPr>
+            <w:r>
+              <w:rPr>
+                <w:b w:val="0"/>
+                <w:color w:val="000000"/>
+                <w:sz w:val="17"/>
+              </w:rPr>
+              <w:t>$49.3m</w:t>
+            </w:r>
+          </w:p>
+        </w:tc>
+      </w:tr>
+      <w:tr>
+        <w:tc>
+          <w:tcPr>
+            <w:tcW w:type="dxa" w:w="2952"/>
+            <w:vAlign w:val="center"/>
+            <w:shd w:fill="F1F5F5"/>
+            <w:tcMar>
+              <w:top w:w="60" w:type="dxa"/>
+              <w:bottom w:w="60" w:type="dxa"/>
+              <w:left w:w="60" w:type="dxa"/>
+              <w:right w:w="60" w:type="dxa"/>
+            </w:tcMar>
+            <w:tcBorders>
+              <w:top w:val="single" w:sz="4" w:color="D9D9D9"/>
+              <w:bottom w:val="single" w:sz="4" w:color="D9D9D9"/>
+              <w:left w:val="single" w:sz="4" w:color="D9D9D9"/>
+              <w:right w:val="single" w:sz="4" w:color="D9D9D9"/>
+            </w:tcBorders>
+          </w:tcPr>
+          <w:p>
+            <w:pPr>
+              <w:spacing w:after="0" w:line="245" w:lineRule="auto"/>
+            </w:pPr>
+            <w:r>
+              <w:rPr>
+                <w:b w:val="0"/>
+                <w:color w:val="000000"/>
+                <w:sz w:val="17"/>
+              </w:rPr>
+              <w:t>+12 months / Build</w:t>
+            </w:r>
+          </w:p>
+        </w:tc>
+        <w:tc>
+          <w:tcPr>
+            <w:tcW w:type="dxa" w:w="1728"/>
+            <w:vAlign w:val="center"/>
+            <w:shd w:fill="F1F5F5"/>
+            <w:tcMar>
+              <w:top w:w="60" w:type="dxa"/>
+              <w:bottom w:w="60" w:type="dxa"/>
+              <w:left w:w="60" w:type="dxa"/>
+              <w:right w:w="60" w:type="dxa"/>
+            </w:tcMar>
+            <w:tcBorders>
+              <w:top w:val="single" w:sz="4" w:color="D9D9D9"/>
+              <w:bottom w:val="single" w:sz="4" w:color="D9D9D9"/>
+              <w:left w:val="single" w:sz="4" w:color="D9D9D9"/>
+              <w:right w:val="single" w:sz="4" w:color="D9D9D9"/>
+            </w:tcBorders>
+          </w:tcPr>
+          <w:p>
+            <w:pPr>
+              <w:spacing w:after="0" w:line="245" w:lineRule="auto"/>
+              <w:jc w:val="right"/>
+            </w:pPr>
+            <w:r>
+              <w:rPr>
+                <w:b w:val="0"/>
+                <w:color w:val="000000"/>
+                <w:sz w:val="17"/>
+              </w:rPr>
+              <w:t>$523.1m</w:t>
+            </w:r>
+          </w:p>
+        </w:tc>
+        <w:tc>
+          <w:tcPr>
+            <w:tcW w:type="dxa" w:w="1613"/>
+            <w:vAlign w:val="center"/>
+            <w:shd w:fill="F1F5F5"/>
+            <w:tcMar>
+              <w:top w:w="60" w:type="dxa"/>
+              <w:bottom w:w="60" w:type="dxa"/>
+              <w:left w:w="60" w:type="dxa"/>
+              <w:right w:w="60" w:type="dxa"/>
+            </w:tcMar>
+            <w:tcBorders>
+              <w:top w:val="single" w:sz="4" w:color="D9D9D9"/>
+              <w:bottom w:val="single" w:sz="4" w:color="D9D9D9"/>
+              <w:left w:val="single" w:sz="4" w:color="D9D9D9"/>
+              <w:right w:val="single" w:sz="4" w:color="D9D9D9"/>
+            </w:tcBorders>
+          </w:tcPr>
+          <w:p>
+            <w:pPr>
+              <w:spacing w:after="0" w:line="245" w:lineRule="auto"/>
+              <w:jc w:val="right"/>
+            </w:pPr>
+            <w:r>
+              <w:rPr>
+                <w:b w:val="0"/>
+                <w:color w:val="000000"/>
+                <w:sz w:val="17"/>
+              </w:rPr>
+              <w:t>$55.5m</w:t>
+            </w:r>
+          </w:p>
+        </w:tc>
+        <w:tc>
+          <w:tcPr>
+            <w:tcW w:type="dxa" w:w="1570"/>
+            <w:vAlign w:val="center"/>
+            <w:shd w:fill="F1F5F5"/>
+            <w:tcMar>
+              <w:top w:w="60" w:type="dxa"/>
+              <w:bottom w:w="60" w:type="dxa"/>
+              <w:left w:w="60" w:type="dxa"/>
+              <w:right w:w="60" w:type="dxa"/>
+            </w:tcMar>
+            <w:tcBorders>
+              <w:top w:val="single" w:sz="4" w:color="D9D9D9"/>
+              <w:bottom w:val="single" w:sz="4" w:color="D9D9D9"/>
+              <w:left w:val="single" w:sz="4" w:color="D9D9D9"/>
+              <w:right w:val="single" w:sz="4" w:color="D9D9D9"/>
+            </w:tcBorders>
+          </w:tcPr>
+          <w:p>
+            <w:pPr>
+              <w:spacing w:after="0" w:line="245" w:lineRule="auto"/>
+              <w:jc w:val="right"/>
+            </w:pPr>
+            <w:r>
+              <w:rPr>
+                <w:b w:val="0"/>
+                <w:color w:val="000000"/>
+                <w:sz w:val="17"/>
+              </w:rPr>
+              <w:t>$2.51</w:t>
+            </w:r>
+          </w:p>
+        </w:tc>
+        <w:tc>
+          <w:tcPr>
+            <w:tcW w:type="dxa" w:w="2189"/>
+            <w:vAlign w:val="center"/>
+            <w:shd w:fill="F1F5F5"/>
+            <w:tcMar>
+              <w:top w:w="60" w:type="dxa"/>
+              <w:bottom w:w="60" w:type="dxa"/>
+              <w:left w:w="60" w:type="dxa"/>
+              <w:right w:w="60" w:type="dxa"/>
+            </w:tcMar>
+            <w:tcBorders>
+              <w:top w:val="single" w:sz="4" w:color="D9D9D9"/>
+              <w:bottom w:val="single" w:sz="4" w:color="D9D9D9"/>
+              <w:left w:val="single" w:sz="4" w:color="D9D9D9"/>
+              <w:right w:val="single" w:sz="4" w:color="D9D9D9"/>
+            </w:tcBorders>
+          </w:tcPr>
+          <w:p>
+            <w:pPr>
+              <w:spacing w:after="0" w:line="245" w:lineRule="auto"/>
+              <w:jc w:val="right"/>
+            </w:pPr>
+            <w:r>
+              <w:rPr>
+                <w:b w:val="0"/>
+                <w:color w:val="000000"/>
+                <w:sz w:val="17"/>
+              </w:rPr>
+              <w:t>$436.1m</w:t>
+            </w:r>
+          </w:p>
+        </w:tc>
+      </w:tr>
+      <w:tr>
+        <w:tc>
+          <w:tcPr>
+            <w:tcW w:type="dxa" w:w="2952"/>
+            <w:vAlign w:val="center"/>
+            <w:shd w:fill="FFFFFF"/>
+            <w:tcMar>
+              <w:top w:w="60" w:type="dxa"/>
+              <w:bottom w:w="60" w:type="dxa"/>
+              <w:left w:w="60" w:type="dxa"/>
+              <w:right w:w="60" w:type="dxa"/>
+            </w:tcMar>
+            <w:tcBorders>
+              <w:top w:val="single" w:sz="4" w:color="D9D9D9"/>
+              <w:bottom w:val="single" w:sz="4" w:color="D9D9D9"/>
+              <w:left w:val="single" w:sz="4" w:color="D9D9D9"/>
+              <w:right w:val="single" w:sz="4" w:color="D9D9D9"/>
+            </w:tcBorders>
+          </w:tcPr>
+          <w:p>
+            <w:pPr>
+              <w:spacing w:after="0" w:line="245" w:lineRule="auto"/>
+            </w:pPr>
+            <w:r>
+              <w:rPr>
+                <w:b w:val="0"/>
+                <w:color w:val="000000"/>
+                <w:sz w:val="17"/>
+              </w:rPr>
+              <w:t>+12 months / Lease</w:t>
+            </w:r>
+          </w:p>
+        </w:tc>
+        <w:tc>
+          <w:tcPr>
+            <w:tcW w:type="dxa" w:w="1728"/>
+            <w:vAlign w:val="center"/>
+            <w:shd w:fill="FFFFFF"/>
+            <w:tcMar>
+              <w:top w:w="60" w:type="dxa"/>
+              <w:bottom w:w="60" w:type="dxa"/>
+              <w:left w:w="60" w:type="dxa"/>
+              <w:right w:w="60" w:type="dxa"/>
+            </w:tcMar>
+            <w:tcBorders>
+              <w:top w:val="single" w:sz="4" w:color="D9D9D9"/>
+              <w:bottom w:val="single" w:sz="4" w:color="D9D9D9"/>
+              <w:left w:val="single" w:sz="4" w:color="D9D9D9"/>
+              <w:right w:val="single" w:sz="4" w:color="D9D9D9"/>
+            </w:tcBorders>
+          </w:tcPr>
+          <w:p>
+            <w:pPr>
+              <w:spacing w:after="0" w:line="245" w:lineRule="auto"/>
+              <w:jc w:val="right"/>
+            </w:pPr>
+            <w:r>
+              <w:rPr>
+                <w:b w:val="0"/>
+                <w:color w:val="000000"/>
+                <w:sz w:val="17"/>
+              </w:rPr>
+              <w:t>$0.0m</w:t>
+            </w:r>
+          </w:p>
+        </w:tc>
+        <w:tc>
+          <w:tcPr>
+            <w:tcW w:type="dxa" w:w="1613"/>
+            <w:vAlign w:val="center"/>
+            <w:shd w:fill="FFFFFF"/>
+            <w:tcMar>
+              <w:top w:w="60" w:type="dxa"/>
+              <w:bottom w:w="60" w:type="dxa"/>
+              <w:left w:w="60" w:type="dxa"/>
+              <w:right w:w="60" w:type="dxa"/>
+            </w:tcMar>
+            <w:tcBorders>
+              <w:top w:val="single" w:sz="4" w:color="D9D9D9"/>
+              <w:bottom w:val="single" w:sz="4" w:color="D9D9D9"/>
+              <w:left w:val="single" w:sz="4" w:color="D9D9D9"/>
+              <w:right w:val="single" w:sz="4" w:color="D9D9D9"/>
+            </w:tcBorders>
+          </w:tcPr>
+          <w:p>
+            <w:pPr>
+              <w:spacing w:after="0" w:line="245" w:lineRule="auto"/>
+              <w:jc w:val="right"/>
+            </w:pPr>
+            <w:r>
+              <w:rPr>
+                <w:b w:val="0"/>
+                <w:color w:val="000000"/>
+                <w:sz w:val="17"/>
+              </w:rPr>
+              <w:t>$92.0m</w:t>
+            </w:r>
+          </w:p>
+        </w:tc>
+        <w:tc>
+          <w:tcPr>
+            <w:tcW w:type="dxa" w:w="1570"/>
+            <w:vAlign w:val="center"/>
+            <w:shd w:fill="FFFFFF"/>
+            <w:tcMar>
+              <w:top w:w="60" w:type="dxa"/>
+              <w:bottom w:w="60" w:type="dxa"/>
+              <w:left w:w="60" w:type="dxa"/>
+              <w:right w:w="60" w:type="dxa"/>
+            </w:tcMar>
+            <w:tcBorders>
+              <w:top w:val="single" w:sz="4" w:color="D9D9D9"/>
+              <w:bottom w:val="single" w:sz="4" w:color="D9D9D9"/>
+              <w:left w:val="single" w:sz="4" w:color="D9D9D9"/>
+              <w:right w:val="single" w:sz="4" w:color="D9D9D9"/>
+            </w:tcBorders>
+          </w:tcPr>
+          <w:p>
+            <w:pPr>
+              <w:spacing w:after="0" w:line="245" w:lineRule="auto"/>
+              <w:jc w:val="right"/>
+            </w:pPr>
+            <w:r>
+              <w:rPr>
+                <w:b w:val="0"/>
+                <w:color w:val="000000"/>
+                <w:sz w:val="17"/>
+              </w:rPr>
+              <w:t>$1.50</w:t>
+            </w:r>
+          </w:p>
+        </w:tc>
+        <w:tc>
+          <w:tcPr>
+            <w:tcW w:type="dxa" w:w="2189"/>
+            <w:vAlign w:val="center"/>
+            <w:shd w:fill="FFFFFF"/>
+            <w:tcMar>
+              <w:top w:w="60" w:type="dxa"/>
+              <w:bottom w:w="60" w:type="dxa"/>
+              <w:left w:w="60" w:type="dxa"/>
+              <w:right w:w="60" w:type="dxa"/>
+            </w:tcMar>
+            <w:tcBorders>
+              <w:top w:val="single" w:sz="4" w:color="D9D9D9"/>
+              <w:bottom w:val="single" w:sz="4" w:color="D9D9D9"/>
+              <w:left w:val="single" w:sz="4" w:color="D9D9D9"/>
+              <w:right w:val="single" w:sz="4" w:color="D9D9D9"/>
+            </w:tcBorders>
+          </w:tcPr>
+          <w:p>
+            <w:pPr>
+              <w:spacing w:after="0" w:line="245" w:lineRule="auto"/>
+              <w:jc w:val="right"/>
+            </w:pPr>
+            <w:r>
+              <w:rPr>
+                <w:b w:val="0"/>
+                <w:color w:val="000000"/>
+                <w:sz w:val="17"/>
+              </w:rPr>
+              <w:t>$0.0m</w:t>
+            </w:r>
+          </w:p>
+        </w:tc>
+      </w:tr>
+      <w:tr>
+        <w:tc>
+          <w:tcPr>
+            <w:tcW w:type="dxa" w:w="2952"/>
+            <w:vAlign w:val="center"/>
+            <w:shd w:fill="F1F5F5"/>
+            <w:tcMar>
+              <w:top w:w="60" w:type="dxa"/>
+              <w:bottom w:w="60" w:type="dxa"/>
+              <w:left w:w="60" w:type="dxa"/>
+              <w:right w:w="60" w:type="dxa"/>
+            </w:tcMar>
+            <w:tcBorders>
+              <w:top w:val="single" w:sz="4" w:color="D9D9D9"/>
+              <w:bottom w:val="single" w:sz="4" w:color="D9D9D9"/>
+              <w:left w:val="single" w:sz="4" w:color="D9D9D9"/>
+              <w:right w:val="single" w:sz="4" w:color="D9D9D9"/>
+            </w:tcBorders>
+          </w:tcPr>
+          <w:p>
+            <w:pPr>
+              <w:spacing w:after="0" w:line="245" w:lineRule="auto"/>
+            </w:pPr>
+            <w:r>
+              <w:rPr>
+                <w:b w:val="0"/>
+                <w:color w:val="000000"/>
+                <w:sz w:val="17"/>
+              </w:rPr>
+              <w:t>+12 months / Hybrid</w:t>
+            </w:r>
+          </w:p>
+        </w:tc>
+        <w:tc>
+          <w:tcPr>
+            <w:tcW w:type="dxa" w:w="1728"/>
+            <w:vAlign w:val="center"/>
+            <w:shd w:fill="F1F5F5"/>
+            <w:tcMar>
+              <w:top w:w="60" w:type="dxa"/>
+              <w:bottom w:w="60" w:type="dxa"/>
+              <w:left w:w="60" w:type="dxa"/>
+              <w:right w:w="60" w:type="dxa"/>
+            </w:tcMar>
+            <w:tcBorders>
+              <w:top w:val="single" w:sz="4" w:color="D9D9D9"/>
+              <w:bottom w:val="single" w:sz="4" w:color="D9D9D9"/>
+              <w:left w:val="single" w:sz="4" w:color="D9D9D9"/>
+              <w:right w:val="single" w:sz="4" w:color="D9D9D9"/>
+            </w:tcBorders>
+          </w:tcPr>
+          <w:p>
+            <w:pPr>
+              <w:spacing w:after="0" w:line="245" w:lineRule="auto"/>
+              <w:jc w:val="right"/>
+            </w:pPr>
+            <w:r>
+              <w:rPr>
+                <w:b w:val="0"/>
+                <w:color w:val="000000"/>
+                <w:sz w:val="17"/>
+              </w:rPr>
+              <w:t>$666.1m</w:t>
+            </w:r>
+          </w:p>
+        </w:tc>
+        <w:tc>
+          <w:tcPr>
+            <w:tcW w:type="dxa" w:w="1613"/>
+            <w:vAlign w:val="center"/>
+            <w:shd w:fill="F1F5F5"/>
+            <w:tcMar>
+              <w:top w:w="60" w:type="dxa"/>
+              <w:bottom w:w="60" w:type="dxa"/>
+              <w:left w:w="60" w:type="dxa"/>
+              <w:right w:w="60" w:type="dxa"/>
+            </w:tcMar>
+            <w:tcBorders>
+              <w:top w:val="single" w:sz="4" w:color="D9D9D9"/>
+              <w:bottom w:val="single" w:sz="4" w:color="D9D9D9"/>
+              <w:left w:val="single" w:sz="4" w:color="D9D9D9"/>
+              <w:right w:val="single" w:sz="4" w:color="D9D9D9"/>
+            </w:tcBorders>
+          </w:tcPr>
+          <w:p>
+            <w:pPr>
+              <w:spacing w:after="0" w:line="245" w:lineRule="auto"/>
+              <w:jc w:val="right"/>
+            </w:pPr>
+            <w:r>
+              <w:rPr>
+                <w:b w:val="0"/>
+                <w:color w:val="000000"/>
+                <w:sz w:val="17"/>
+              </w:rPr>
+              <w:t>$75.8m</w:t>
+            </w:r>
+          </w:p>
+        </w:tc>
+        <w:tc>
+          <w:tcPr>
+            <w:tcW w:type="dxa" w:w="1570"/>
+            <w:vAlign w:val="center"/>
+            <w:shd w:fill="F1F5F5"/>
+            <w:tcMar>
+              <w:top w:w="60" w:type="dxa"/>
+              <w:bottom w:w="60" w:type="dxa"/>
+              <w:left w:w="60" w:type="dxa"/>
+              <w:right w:w="60" w:type="dxa"/>
+            </w:tcMar>
+            <w:tcBorders>
+              <w:top w:val="single" w:sz="4" w:color="D9D9D9"/>
+              <w:bottom w:val="single" w:sz="4" w:color="D9D9D9"/>
+              <w:left w:val="single" w:sz="4" w:color="D9D9D9"/>
+              <w:right w:val="single" w:sz="4" w:color="D9D9D9"/>
+            </w:tcBorders>
+          </w:tcPr>
+          <w:p>
+            <w:pPr>
+              <w:spacing w:after="0" w:line="245" w:lineRule="auto"/>
+              <w:jc w:val="right"/>
+            </w:pPr>
+            <w:r>
+              <w:rPr>
+                <w:b w:val="0"/>
+                <w:color w:val="000000"/>
+                <w:sz w:val="17"/>
+              </w:rPr>
+              <w:t>$1.88</w:t>
+            </w:r>
+          </w:p>
+        </w:tc>
+        <w:tc>
+          <w:tcPr>
+            <w:tcW w:type="dxa" w:w="2189"/>
+            <w:vAlign w:val="center"/>
+            <w:shd w:fill="F1F5F5"/>
+            <w:tcMar>
+              <w:top w:w="60" w:type="dxa"/>
+              <w:bottom w:w="60" w:type="dxa"/>
+              <w:left w:w="60" w:type="dxa"/>
+              <w:right w:w="60" w:type="dxa"/>
+            </w:tcMar>
+            <w:tcBorders>
+              <w:top w:val="single" w:sz="4" w:color="D9D9D9"/>
+              <w:bottom w:val="single" w:sz="4" w:color="D9D9D9"/>
+              <w:left w:val="single" w:sz="4" w:color="D9D9D9"/>
+              <w:right w:val="single" w:sz="4" w:color="D9D9D9"/>
+            </w:tcBorders>
+          </w:tcPr>
+          <w:p>
+            <w:pPr>
+              <w:spacing w:after="0" w:line="245" w:lineRule="auto"/>
+              <w:jc w:val="right"/>
+            </w:pPr>
+            <w:r>
+              <w:rPr>
+                <w:b w:val="0"/>
+                <w:color w:val="000000"/>
+                <w:sz w:val="17"/>
+              </w:rPr>
+              <w:t>$49.3m</w:t>
+            </w:r>
+          </w:p>
+        </w:tc>
+      </w:tr>
+      <w:tr>
+        <w:tc>
+          <w:tcPr>
+            <w:tcW w:type="dxa" w:w="2952"/>
+            <w:vAlign w:val="center"/>
+            <w:shd w:fill="FFFFFF"/>
+            <w:tcMar>
+              <w:top w:w="60" w:type="dxa"/>
+              <w:bottom w:w="60" w:type="dxa"/>
+              <w:left w:w="60" w:type="dxa"/>
+              <w:right w:w="60" w:type="dxa"/>
+            </w:tcMar>
+            <w:tcBorders>
+              <w:top w:val="single" w:sz="4" w:color="D9D9D9"/>
+              <w:bottom w:val="single" w:sz="4" w:color="D9D9D9"/>
+              <w:left w:val="single" w:sz="4" w:color="D9D9D9"/>
+              <w:right w:val="single" w:sz="4" w:color="D9D9D9"/>
+            </w:tcBorders>
+          </w:tcPr>
+          <w:p>
+            <w:pPr>
+              <w:spacing w:after="0" w:line="245" w:lineRule="auto"/>
+            </w:pPr>
+            <w:r>
+              <w:rPr>
+                <w:b w:val="0"/>
+                <w:color w:val="000000"/>
+                <w:sz w:val="17"/>
+              </w:rPr>
+              <w:t>Half utilization / Build</w:t>
+            </w:r>
+          </w:p>
+        </w:tc>
+        <w:tc>
+          <w:tcPr>
+            <w:tcW w:type="dxa" w:w="1728"/>
+            <w:vAlign w:val="center"/>
+            <w:shd w:fill="FFFFFF"/>
+            <w:tcMar>
+              <w:top w:w="60" w:type="dxa"/>
+              <w:bottom w:w="60" w:type="dxa"/>
+              <w:left w:w="60" w:type="dxa"/>
+              <w:right w:w="60" w:type="dxa"/>
+            </w:tcMar>
+            <w:tcBorders>
+              <w:top w:val="single" w:sz="4" w:color="D9D9D9"/>
+              <w:bottom w:val="single" w:sz="4" w:color="D9D9D9"/>
+              <w:left w:val="single" w:sz="4" w:color="D9D9D9"/>
+              <w:right w:val="single" w:sz="4" w:color="D9D9D9"/>
+            </w:tcBorders>
+          </w:tcPr>
+          <w:p>
+            <w:pPr>
+              <w:spacing w:after="0" w:line="245" w:lineRule="auto"/>
+              <w:jc w:val="right"/>
+            </w:pPr>
+            <w:r>
+              <w:rPr>
+                <w:b w:val="0"/>
+                <w:color w:val="000000"/>
+                <w:sz w:val="17"/>
+              </w:rPr>
+              <w:t>$489.0m</w:t>
+            </w:r>
+          </w:p>
+        </w:tc>
+        <w:tc>
+          <w:tcPr>
+            <w:tcW w:type="dxa" w:w="1613"/>
+            <w:vAlign w:val="center"/>
+            <w:shd w:fill="FFFFFF"/>
+            <w:tcMar>
+              <w:top w:w="60" w:type="dxa"/>
+              <w:bottom w:w="60" w:type="dxa"/>
+              <w:left w:w="60" w:type="dxa"/>
+              <w:right w:w="60" w:type="dxa"/>
+            </w:tcMar>
+            <w:tcBorders>
+              <w:top w:val="single" w:sz="4" w:color="D9D9D9"/>
+              <w:bottom w:val="single" w:sz="4" w:color="D9D9D9"/>
+              <w:left w:val="single" w:sz="4" w:color="D9D9D9"/>
+              <w:right w:val="single" w:sz="4" w:color="D9D9D9"/>
+            </w:tcBorders>
+          </w:tcPr>
+          <w:p>
+            <w:pPr>
+              <w:spacing w:after="0" w:line="245" w:lineRule="auto"/>
+              <w:jc w:val="right"/>
+            </w:pPr>
+            <w:r>
+              <w:rPr>
+                <w:b w:val="0"/>
+                <w:color w:val="000000"/>
+                <w:sz w:val="17"/>
+              </w:rPr>
+              <w:t>$55.5m</w:t>
+            </w:r>
+          </w:p>
+        </w:tc>
+        <w:tc>
+          <w:tcPr>
+            <w:tcW w:type="dxa" w:w="1570"/>
+            <w:vAlign w:val="center"/>
+            <w:shd w:fill="FFFFFF"/>
+            <w:tcMar>
+              <w:top w:w="60" w:type="dxa"/>
+              <w:bottom w:w="60" w:type="dxa"/>
+              <w:left w:w="60" w:type="dxa"/>
+              <w:right w:w="60" w:type="dxa"/>
+            </w:tcMar>
+            <w:tcBorders>
+              <w:top w:val="single" w:sz="4" w:color="D9D9D9"/>
+              <w:bottom w:val="single" w:sz="4" w:color="D9D9D9"/>
+              <w:left w:val="single" w:sz="4" w:color="D9D9D9"/>
+              <w:right w:val="single" w:sz="4" w:color="D9D9D9"/>
+            </w:tcBorders>
+          </w:tcPr>
+          <w:p>
+            <w:pPr>
+              <w:spacing w:after="0" w:line="245" w:lineRule="auto"/>
+              <w:jc w:val="right"/>
+            </w:pPr>
+            <w:r>
+              <w:rPr>
+                <w:b w:val="0"/>
+                <w:color w:val="000000"/>
+                <w:sz w:val="17"/>
+              </w:rPr>
+              <w:t>$5.35</w:t>
+            </w:r>
+          </w:p>
+        </w:tc>
+        <w:tc>
+          <w:tcPr>
+            <w:tcW w:type="dxa" w:w="2189"/>
+            <w:vAlign w:val="center"/>
+            <w:shd w:fill="FFFFFF"/>
+            <w:tcMar>
+              <w:top w:w="60" w:type="dxa"/>
+              <w:bottom w:w="60" w:type="dxa"/>
+              <w:left w:w="60" w:type="dxa"/>
+              <w:right w:w="60" w:type="dxa"/>
+            </w:tcMar>
+            <w:tcBorders>
+              <w:top w:val="single" w:sz="4" w:color="D9D9D9"/>
+              <w:bottom w:val="single" w:sz="4" w:color="D9D9D9"/>
+              <w:left w:val="single" w:sz="4" w:color="D9D9D9"/>
+              <w:right w:val="single" w:sz="4" w:color="D9D9D9"/>
+            </w:tcBorders>
+          </w:tcPr>
+          <w:p>
+            <w:pPr>
+              <w:spacing w:after="0" w:line="245" w:lineRule="auto"/>
+              <w:jc w:val="right"/>
+            </w:pPr>
+            <w:r>
+              <w:rPr>
+                <w:b w:val="0"/>
+                <w:color w:val="000000"/>
+                <w:sz w:val="17"/>
+              </w:rPr>
+              <w:t>$420.2m</w:t>
+            </w:r>
+          </w:p>
+        </w:tc>
+      </w:tr>
+      <w:tr>
+        <w:tc>
+          <w:tcPr>
+            <w:tcW w:type="dxa" w:w="2952"/>
+            <w:vAlign w:val="center"/>
+            <w:shd w:fill="F1F5F5"/>
+            <w:tcMar>
+              <w:top w:w="60" w:type="dxa"/>
+              <w:bottom w:w="60" w:type="dxa"/>
+              <w:left w:w="60" w:type="dxa"/>
+              <w:right w:w="60" w:type="dxa"/>
+            </w:tcMar>
+            <w:tcBorders>
+              <w:top w:val="single" w:sz="4" w:color="D9D9D9"/>
+              <w:bottom w:val="single" w:sz="4" w:color="D9D9D9"/>
+              <w:left w:val="single" w:sz="4" w:color="D9D9D9"/>
+              <w:right w:val="single" w:sz="4" w:color="D9D9D9"/>
+            </w:tcBorders>
+          </w:tcPr>
+          <w:p>
+            <w:pPr>
+              <w:spacing w:after="0" w:line="245" w:lineRule="auto"/>
+            </w:pPr>
+            <w:r>
+              <w:rPr>
+                <w:b w:val="0"/>
+                <w:color w:val="000000"/>
+                <w:sz w:val="17"/>
+              </w:rPr>
+              <w:t>Half utilization / Lease</w:t>
+            </w:r>
+          </w:p>
+        </w:tc>
+        <w:tc>
+          <w:tcPr>
+            <w:tcW w:type="dxa" w:w="1728"/>
+            <w:vAlign w:val="center"/>
+            <w:shd w:fill="F1F5F5"/>
+            <w:tcMar>
+              <w:top w:w="60" w:type="dxa"/>
+              <w:bottom w:w="60" w:type="dxa"/>
+              <w:left w:w="60" w:type="dxa"/>
+              <w:right w:w="60" w:type="dxa"/>
+            </w:tcMar>
+            <w:tcBorders>
+              <w:top w:val="single" w:sz="4" w:color="D9D9D9"/>
+              <w:bottom w:val="single" w:sz="4" w:color="D9D9D9"/>
+              <w:left w:val="single" w:sz="4" w:color="D9D9D9"/>
+              <w:right w:val="single" w:sz="4" w:color="D9D9D9"/>
+            </w:tcBorders>
+          </w:tcPr>
+          <w:p>
+            <w:pPr>
+              <w:spacing w:after="0" w:line="245" w:lineRule="auto"/>
+              <w:jc w:val="right"/>
+            </w:pPr>
+            <w:r>
+              <w:rPr>
+                <w:b w:val="0"/>
+                <w:color w:val="000000"/>
+                <w:sz w:val="17"/>
+              </w:rPr>
+              <w:t>$0.0m</w:t>
+            </w:r>
+          </w:p>
+        </w:tc>
+        <w:tc>
+          <w:tcPr>
+            <w:tcW w:type="dxa" w:w="1613"/>
+            <w:vAlign w:val="center"/>
+            <w:shd w:fill="F1F5F5"/>
+            <w:tcMar>
+              <w:top w:w="60" w:type="dxa"/>
+              <w:bottom w:w="60" w:type="dxa"/>
+              <w:left w:w="60" w:type="dxa"/>
+              <w:right w:w="60" w:type="dxa"/>
+            </w:tcMar>
+            <w:tcBorders>
+              <w:top w:val="single" w:sz="4" w:color="D9D9D9"/>
+              <w:bottom w:val="single" w:sz="4" w:color="D9D9D9"/>
+              <w:left w:val="single" w:sz="4" w:color="D9D9D9"/>
+              <w:right w:val="single" w:sz="4" w:color="D9D9D9"/>
+            </w:tcBorders>
+          </w:tcPr>
+          <w:p>
+            <w:pPr>
+              <w:spacing w:after="0" w:line="245" w:lineRule="auto"/>
+              <w:jc w:val="right"/>
+            </w:pPr>
+            <w:r>
+              <w:rPr>
+                <w:b w:val="0"/>
+                <w:color w:val="000000"/>
+                <w:sz w:val="17"/>
+              </w:rPr>
+              <w:t>$92.0m</w:t>
+            </w:r>
+          </w:p>
+        </w:tc>
+        <w:tc>
+          <w:tcPr>
+            <w:tcW w:type="dxa" w:w="1570"/>
+            <w:vAlign w:val="center"/>
+            <w:shd w:fill="F1F5F5"/>
+            <w:tcMar>
+              <w:top w:w="60" w:type="dxa"/>
+              <w:bottom w:w="60" w:type="dxa"/>
+              <w:left w:w="60" w:type="dxa"/>
+              <w:right w:w="60" w:type="dxa"/>
+            </w:tcMar>
+            <w:tcBorders>
+              <w:top w:val="single" w:sz="4" w:color="D9D9D9"/>
+              <w:bottom w:val="single" w:sz="4" w:color="D9D9D9"/>
+              <w:left w:val="single" w:sz="4" w:color="D9D9D9"/>
+              <w:right w:val="single" w:sz="4" w:color="D9D9D9"/>
+            </w:tcBorders>
+          </w:tcPr>
+          <w:p>
+            <w:pPr>
+              <w:spacing w:after="0" w:line="245" w:lineRule="auto"/>
+              <w:jc w:val="right"/>
+            </w:pPr>
+            <w:r>
+              <w:rPr>
+                <w:b w:val="0"/>
+                <w:color w:val="000000"/>
+                <w:sz w:val="17"/>
+              </w:rPr>
+              <w:t>$2.99</w:t>
+            </w:r>
+          </w:p>
+        </w:tc>
+        <w:tc>
+          <w:tcPr>
+            <w:tcW w:type="dxa" w:w="2189"/>
+            <w:vAlign w:val="center"/>
+            <w:shd w:fill="F1F5F5"/>
+            <w:tcMar>
+              <w:top w:w="60" w:type="dxa"/>
+              <w:bottom w:w="60" w:type="dxa"/>
+              <w:left w:w="60" w:type="dxa"/>
+              <w:right w:w="60" w:type="dxa"/>
+            </w:tcMar>
+            <w:tcBorders>
+              <w:top w:val="single" w:sz="4" w:color="D9D9D9"/>
+              <w:bottom w:val="single" w:sz="4" w:color="D9D9D9"/>
+              <w:left w:val="single" w:sz="4" w:color="D9D9D9"/>
+              <w:right w:val="single" w:sz="4" w:color="D9D9D9"/>
+            </w:tcBorders>
+          </w:tcPr>
+          <w:p>
+            <w:pPr>
+              <w:spacing w:after="0" w:line="245" w:lineRule="auto"/>
+              <w:jc w:val="right"/>
+            </w:pPr>
+            <w:r>
+              <w:rPr>
+                <w:b w:val="0"/>
+                <w:color w:val="000000"/>
+                <w:sz w:val="17"/>
+              </w:rPr>
+              <w:t>$0.0m</w:t>
+            </w:r>
+          </w:p>
+        </w:tc>
+      </w:tr>
+      <w:tr>
+        <w:tc>
+          <w:tcPr>
+            <w:tcW w:type="dxa" w:w="2952"/>
+            <w:vAlign w:val="center"/>
+            <w:shd w:fill="FFFFFF"/>
+            <w:tcMar>
+              <w:top w:w="60" w:type="dxa"/>
+              <w:bottom w:w="60" w:type="dxa"/>
+              <w:left w:w="60" w:type="dxa"/>
+              <w:right w:w="60" w:type="dxa"/>
+            </w:tcMar>
+            <w:tcBorders>
+              <w:top w:val="single" w:sz="4" w:color="D9D9D9"/>
+              <w:bottom w:val="single" w:sz="4" w:color="D9D9D9"/>
+              <w:left w:val="single" w:sz="4" w:color="D9D9D9"/>
+              <w:right w:val="single" w:sz="4" w:color="D9D9D9"/>
+            </w:tcBorders>
+          </w:tcPr>
+          <w:p>
+            <w:pPr>
+              <w:spacing w:after="0" w:line="245" w:lineRule="auto"/>
+            </w:pPr>
+            <w:r>
+              <w:rPr>
+                <w:b w:val="0"/>
+                <w:color w:val="000000"/>
+                <w:sz w:val="17"/>
+              </w:rPr>
+              <w:t>Half utilization / Hybrid</w:t>
+            </w:r>
+          </w:p>
+        </w:tc>
+        <w:tc>
+          <w:tcPr>
+            <w:tcW w:type="dxa" w:w="1728"/>
+            <w:vAlign w:val="center"/>
+            <w:shd w:fill="FFFFFF"/>
+            <w:tcMar>
+              <w:top w:w="60" w:type="dxa"/>
+              <w:bottom w:w="60" w:type="dxa"/>
+              <w:left w:w="60" w:type="dxa"/>
+              <w:right w:w="60" w:type="dxa"/>
+            </w:tcMar>
+            <w:tcBorders>
+              <w:top w:val="single" w:sz="4" w:color="D9D9D9"/>
+              <w:bottom w:val="single" w:sz="4" w:color="D9D9D9"/>
+              <w:left w:val="single" w:sz="4" w:color="D9D9D9"/>
+              <w:right w:val="single" w:sz="4" w:color="D9D9D9"/>
+            </w:tcBorders>
+          </w:tcPr>
+          <w:p>
+            <w:pPr>
+              <w:spacing w:after="0" w:line="245" w:lineRule="auto"/>
+              <w:jc w:val="right"/>
+            </w:pPr>
+            <w:r>
+              <w:rPr>
+                <w:b w:val="0"/>
+                <w:color w:val="000000"/>
+                <w:sz w:val="17"/>
+              </w:rPr>
+              <w:t>$550.7m</w:t>
+            </w:r>
+          </w:p>
+        </w:tc>
+        <w:tc>
+          <w:tcPr>
+            <w:tcW w:type="dxa" w:w="1613"/>
+            <w:vAlign w:val="center"/>
+            <w:shd w:fill="FFFFFF"/>
+            <w:tcMar>
+              <w:top w:w="60" w:type="dxa"/>
+              <w:bottom w:w="60" w:type="dxa"/>
+              <w:left w:w="60" w:type="dxa"/>
+              <w:right w:w="60" w:type="dxa"/>
+            </w:tcMar>
+            <w:tcBorders>
+              <w:top w:val="single" w:sz="4" w:color="D9D9D9"/>
+              <w:bottom w:val="single" w:sz="4" w:color="D9D9D9"/>
+              <w:left w:val="single" w:sz="4" w:color="D9D9D9"/>
+              <w:right w:val="single" w:sz="4" w:color="D9D9D9"/>
+            </w:tcBorders>
+          </w:tcPr>
+          <w:p>
+            <w:pPr>
+              <w:spacing w:after="0" w:line="245" w:lineRule="auto"/>
+              <w:jc w:val="right"/>
+            </w:pPr>
+            <w:r>
+              <w:rPr>
+                <w:b w:val="0"/>
+                <w:color w:val="000000"/>
+                <w:sz w:val="17"/>
+              </w:rPr>
+              <w:t>$75.8m</w:t>
+            </w:r>
+          </w:p>
+        </w:tc>
+        <w:tc>
+          <w:tcPr>
+            <w:tcW w:type="dxa" w:w="1570"/>
+            <w:vAlign w:val="center"/>
+            <w:shd w:fill="FFFFFF"/>
+            <w:tcMar>
+              <w:top w:w="60" w:type="dxa"/>
+              <w:bottom w:w="60" w:type="dxa"/>
+              <w:left w:w="60" w:type="dxa"/>
+              <w:right w:w="60" w:type="dxa"/>
+            </w:tcMar>
+            <w:tcBorders>
+              <w:top w:val="single" w:sz="4" w:color="D9D9D9"/>
+              <w:bottom w:val="single" w:sz="4" w:color="D9D9D9"/>
+              <w:left w:val="single" w:sz="4" w:color="D9D9D9"/>
+              <w:right w:val="single" w:sz="4" w:color="D9D9D9"/>
+            </w:tcBorders>
+          </w:tcPr>
+          <w:p>
+            <w:pPr>
+              <w:spacing w:after="0" w:line="245" w:lineRule="auto"/>
+              <w:jc w:val="right"/>
+            </w:pPr>
+            <w:r>
+              <w:rPr>
+                <w:b w:val="0"/>
+                <w:color w:val="000000"/>
+                <w:sz w:val="17"/>
+              </w:rPr>
+              <w:t>$3.66</w:t>
+            </w:r>
+          </w:p>
+        </w:tc>
+        <w:tc>
+          <w:tcPr>
+            <w:tcW w:type="dxa" w:w="2189"/>
+            <w:vAlign w:val="center"/>
+            <w:shd w:fill="FFFFFF"/>
+            <w:tcMar>
+              <w:top w:w="60" w:type="dxa"/>
+              <w:bottom w:w="60" w:type="dxa"/>
+              <w:left w:w="60" w:type="dxa"/>
+              <w:right w:w="60" w:type="dxa"/>
+            </w:tcMar>
+            <w:tcBorders>
+              <w:top w:val="single" w:sz="4" w:color="D9D9D9"/>
+              <w:bottom w:val="single" w:sz="4" w:color="D9D9D9"/>
+              <w:left w:val="single" w:sz="4" w:color="D9D9D9"/>
+              <w:right w:val="single" w:sz="4" w:color="D9D9D9"/>
+            </w:tcBorders>
+          </w:tcPr>
+          <w:p>
+            <w:pPr>
+              <w:spacing w:after="0" w:line="245" w:lineRule="auto"/>
+              <w:jc w:val="right"/>
+            </w:pPr>
+            <w:r>
+              <w:rPr>
+                <w:b w:val="0"/>
+                <w:color w:val="000000"/>
+                <w:sz w:val="17"/>
+              </w:rPr>
+              <w:t>$49.3m</w:t>
+            </w:r>
+          </w:p>
+        </w:tc>
+      </w:tr>
+    </w:tbl>
     <w:p>
       <w:r>
-        <w:t>Development equity funds the utility study, site control, member-demand survey and early design. Construction debt should follow a connection agreement, priced scope, permits and committed demand. Equipment financing should follow GPU procurement terms and defined operating service levels.</w:t>
+        <w:t>Base delay is 0.5 months (about two weeks) after planned construction. The +12-month case adds one year; half utilization is 32.5%. Operations are the full-service run rate. Capital at risk is modeled year-three loss on spent capital plus delay and interest, after the assumed salvage allowance. Idle capacity is allocated, not counted twice: build's annual allocation is $19.4m. The app retains a separate +3-month sensitivity.</w:t>
       </w:r>
     </w:p>
     <w:p>
       <w:pPr>
         <w:pStyle w:val="Heading1"/>
+        <w:pageBreakBefore w:val="0"/>
       </w:pPr>
       <w:r>
-        <w:t>4. Conditions and reversal tests</w:t>
-      </w:r>
-    </w:p>
-    <w:p>
-      <w:pPr>
-        <w:pStyle w:val="ListBullet"/>
-      </w:pPr>
-      <w:r>
-        <w:t>Get a written energization date and full connection cost for a specific Texas property; confirm large-load rules and curtailment terms.</w:t>
-      </w:r>
-    </w:p>
-    <w:p>
-      <w:pPr>
-        <w:pStyle w:val="ListBullet"/>
-      </w:pPr>
-      <w:r>
-        <w:t>Complete resilience, backup-power, refuelling and closed-loop cooling engineering with permitting implications.</w:t>
-      </w:r>
-    </w:p>
-    <w:p>
-      <w:pPr>
-        <w:pStyle w:val="ListBullet"/>
-      </w:pPr>
-      <w:r>
-        <w:t>Secure member demand commitments, a capacity policy and an acceptable power and carbon-attribute procurement plan.</w:t>
-      </w:r>
-    </w:p>
-    <w:p>
-      <w:pPr>
-        <w:pStyle w:val="ListBullet"/>
-      </w:pPr>
-      <w:r>
-        <w:t>Obtain comparable priced build, lease and hybrid offers with financing and equipment replacement assumptions.</w:t>
+        <w:t>Three findings most likely to change the recommendation</w:t>
       </w:r>
     </w:p>
     <w:p>
       <w:r>
-        <w:t>Re-run the site rubric if Québec offers a materially earlier connection and durable delivered power rate, if member workloads favor batch training or East Coast latency, or if Texas interconnection terms weaken availability or economics. These are decision-changing tests, not reasons to commit capital now.</w:t>
+        <w:t>1. Signed productive demand at acceptable member prices could justify earlier ownership; persistently low use favors leasing or a smaller facility.</w:t>
+        <w:br/>
+        <w:t>2. A binding grid offer with an earlier date, lower delivered cost or different curtailment terms could change the delivery path and country.</w:t>
+        <w:br/>
+        <w:t>3. Site-specific failure and cooling studies, with priced build and lease offers, could overturn assumed uptime, PUE or ownership economics.</w:t>
       </w:r>
     </w:p>
     <w:p>
       <w:pPr>
         <w:pStyle w:val="Heading1"/>
+        <w:pageBreakBefore w:val="0"/>
+      </w:pPr>
+      <w:r>
+        <w:t>Evidence needed to verify uptime</w:t>
+      </w:r>
+    </w:p>
+    <w:p>
+      <w:r>
+        <w:t>The 99.5% availability input is a planning assumption. Agree targets by workload, then verify electrical single lines, failure/repair rates and common-mode risks, maintenance, transfer times, UPS duration, generator derating and black-start tests, 48-hour fuel arrangements, cooling at peak temperature and network/storage recovery. Measure delivered workload availability, not grid reliability alone.</w:t>
+      </w:r>
+    </w:p>
+    <w:p>
+      <w:pPr>
+        <w:pStyle w:val="Heading1"/>
+        <w:pageBreakBefore w:val="0"/>
       </w:pPr>
       <w:r>
         <w:t>Conclusion and recommendation</w:t>
@@ -416,37 +1819,25 @@
     </w:p>
     <w:p>
       <w:r>
-        <w:t>Approve the bounded utility, site and member-demand diligence package. Keep Texas as the base case and Québec and Helsinki as live comparators. The project team should return with a property-specific grid and resilience design, member commitments and comparable priced delivery offers before requesting construction or equipment capital.</w:t>
+        <w:t>Approve capped diligence and leased access. Send the full build back for signed demand, binding grid terms and priced resilient options. Retain Texas as the reference location and Québec and Helsinki as comparators. Return for capital approval only when those findings support a scale and risk allocation members will accept.</w:t>
+      </w:r>
+    </w:p>
+    <w:p>
+      <w:r>
+        <w:rPr>
+          <w:sz w:val="15"/>
+        </w:rPr>
+        <w:t>Basis: challenge brief pp. 2–3; Phase 1 site rubric; site Evidence catalog; shared model export 2026-10-06 22:13 UTC.</w:t>
       </w:r>
     </w:p>
     <w:sectPr>
-      <w:footerReference w:type="default" r:id="rId9"/>
       <w:pgSz w:w="12240" w:h="15840"/>
-      <w:pgMar w:top="1080" w:right="1296" w:bottom="979" w:left="1296" w:header="720" w:footer="720" w:gutter="0"/>
+      <w:pgMar w:top="864" w:right="1094" w:bottom="792" w:left="1094" w:header="720" w:footer="720" w:gutter="0"/>
       <w:cols w:space="720"/>
       <w:docGrid w:linePitch="360"/>
     </w:sectPr>
   </w:body>
 </w:document>
-</file>
-
-<file path=word/footer1.xml><?xml version="1.0" encoding="utf-8"?>
-<w:ftr xmlns:m="http://schemas.openxmlformats.org/officeDocument/2006/math" xmlns:mc="http://schemas.openxmlformats.org/markup-compatibility/2006" xmlns:mo="http://schemas.microsoft.com/office/mac/office/2008/main" xmlns:mv="urn:schemas-microsoft-com:mac:vml" xmlns:o="urn:schemas-microsoft-com:office:office" xmlns:r="http://schemas.openxmlformats.org/officeDocument/2006/relationships" xmlns:v="urn:schemas-microsoft-com:vml" xmlns:w10="urn:schemas-microsoft-com:office:word" xmlns:w14="http://schemas.microsoft.com/office/word/2010/wordml" xmlns:w="http://schemas.openxmlformats.org/wordprocessingml/2006/main" xmlns:wne="http://schemas.microsoft.com/office/word/2006/wordml" xmlns:wp14="http://schemas.microsoft.com/office/word/2010/wordprocessingDrawing" xmlns:wp="http://schemas.openxmlformats.org/drawingml/2006/wordprocessingDrawing" xmlns:wpc="http://schemas.microsoft.com/office/word/2010/wordprocessingCanvas" xmlns:wpg="http://schemas.microsoft.com/office/word/2010/wordprocessingGroup" xmlns:wpi="http://schemas.microsoft.com/office/word/2010/wordprocessingInk" xmlns:wps="http://schemas.microsoft.com/office/word/2010/wordprocessingShape" mc:Ignorable="w14 wp14">
-  <w:p>
-    <w:pPr>
-      <w:pStyle w:val="Footer"/>
-      <w:jc w:val="right"/>
-    </w:pPr>
-    <w:r>
-      <w:rPr>
-        <w:rFonts w:ascii="Arial" w:hAnsi="Arial"/>
-        <w:color w:val="63717A"/>
-        <w:sz w:val="16"/>
-      </w:rPr>
-      <w:t>Shared university AI infrastructure  |  Decision memo</w:t>
-    </w:r>
-  </w:p>
-</w:ftr>
 </file>
 
 <file path=word/numbering.xml><?xml version="1.0" encoding="utf-8"?>
@@ -813,12 +2204,13 @@
     <w:qFormat/>
     <w:rsid w:val="00FC693F"/>
     <w:pPr>
-      <w:spacing w:after="140" w:line="269" w:lineRule="auto"/>
+      <w:spacing w:before="0" w:after="100" w:line="254" w:lineRule="auto"/>
     </w:pPr>
     <w:rPr>
       <w:rFonts w:ascii="Arial" w:hAnsi="Arial"/>
-      <w:color w:val="1C2830"/>
-      <w:sz w:val="21"/>
+      <w:b w:val="0"/>
+      <w:color w:val="000000"/>
+      <w:sz w:val="19"/>
     </w:rPr>
   </w:style>
   <w:style w:type="paragraph" w:styleId="Header">
@@ -876,7 +2268,7 @@
     <w:pPr>
       <w:keepNext/>
       <w:keepLines/>
-      <w:spacing w:before="260" w:after="100"/>
+      <w:spacing w:before="180" w:after="80" w:line="254" w:lineRule="auto"/>
       <w:outlineLvl w:val="0"/>
     </w:pPr>
     <w:rPr>
@@ -884,7 +2276,7 @@
       <w:b/>
       <w:bCs/>
       <w:color w:val="000000"/>
-      <w:sz w:val="25"/>
+      <w:sz w:val="23"/>
       <w:szCs w:val="28"/>
     </w:rPr>
   </w:style>
@@ -900,15 +2292,15 @@
     <w:pPr>
       <w:keepNext/>
       <w:keepLines/>
-      <w:spacing w:before="180" w:after="80"/>
+      <w:spacing w:before="200" w:after="0"/>
       <w:outlineLvl w:val="1"/>
     </w:pPr>
     <w:rPr>
-      <w:rFonts w:asciiTheme="majorHAnsi" w:eastAsiaTheme="majorEastAsia" w:hAnsiTheme="majorHAnsi" w:cstheme="majorBidi" w:ascii="Arial" w:hAnsi="Arial"/>
+      <w:rFonts w:asciiTheme="majorHAnsi" w:eastAsiaTheme="majorEastAsia" w:hAnsiTheme="majorHAnsi" w:cstheme="majorBidi"/>
       <w:b/>
       <w:bCs/>
-      <w:color w:val="000000"/>
-      <w:sz w:val="22"/>
+      <w:color w:val="4F81BD" w:themeColor="accent1"/>
+      <w:sz w:val="26"/>
       <w:szCs w:val="26"/>
     </w:rPr>
   </w:style>
@@ -1163,7 +2555,7 @@
     <w:rsid w:val="00FC693F"/>
     <w:pPr>
       <w:keepNext/>
-      <w:spacing w:after="200" w:line="240" w:lineRule="auto" w:before="0"/>
+      <w:spacing w:after="140" w:line="254" w:lineRule="auto" w:before="0"/>
       <w:contextualSpacing/>
     </w:pPr>
     <w:rPr>
@@ -1172,7 +2564,7 @@
       <w:color w:val="000000"/>
       <w:spacing w:val="5"/>
       <w:kern w:val="28"/>
-      <w:sz w:val="42"/>
+      <w:sz w:val="37"/>
       <w:szCs w:val="52"/>
     </w:rPr>
   </w:style>

</xml_diff>